<commit_message>
docs: expand client report — diagrams, screenshot gallery, page-break discipline
Rebuilds the project report as a 23-page visual deliverable: cover + TOC,
problem→solution narrative, 15 sections, drawn architecture & workflow
diagrams, embedded storefront/admin screenshots, and a complete tech-stack
table. Sections no longer split across pages (KeepTogether + page breaks).
Publishes via the GitHub Pages workflow automatically.

Generated with Codebuff 🤖
Co-Authored-By: Codebuff <noreply@codebuff.com>
</commit_message>
<xml_diff>
--- a/report/Vehicle_Selector_Pro_Project_Report.docx
+++ b/report/Vehicle_Selector_Pro_Project_Report.docx
@@ -4,21 +4,24 @@
   <w:body>
     <w:p>
       <w:pPr>
-        <w:jc w:val="left"/>
+        <w:spacing w:after="0"/>
       </w:pPr>
       <w:r>
         <w:rPr>
           <w:b/>
           <w:color w:val="E04B33"/>
-          <w:sz w:val="68"/>
+          <w:sz w:val="60"/>
         </w:rPr>
         <w:t>Vehicle Selector Pro</w:t>
       </w:r>
     </w:p>
     <w:p>
+      <w:pPr>
+        <w:spacing w:after="40"/>
+      </w:pPr>
       <w:r>
         <w:rPr>
-          <w:b w:val="0"/>
+          <w:b/>
           <w:color w:val="282A2E"/>
           <w:sz w:val="30"/>
         </w:rPr>
@@ -26,32 +29,41 @@
       </w:r>
     </w:p>
     <w:p>
+      <w:pPr>
+        <w:spacing w:after="0"/>
+      </w:pPr>
       <w:r>
         <w:rPr>
+          <w:b w:val="0"/>
           <w:color w:val="6E6E6E"/>
-          <w:sz w:val="21"/>
+          <w:sz w:val="22"/>
         </w:rPr>
-        <w:t>Project Report · August 2026</w:t>
+        <w:t>CLIENT DELIVERABLE</w:t>
       </w:r>
     </w:p>
     <w:p>
       <w:pPr>
-        <w:pBdr>
-          <w:bottom w:val="single" w:sz="12" w:space="1" w:color="E04B33"/>
-        </w:pBdr>
-      </w:pPr>
-    </w:p>
-    <w:p>
-      <w:pPr>
-        <w:pStyle w:val="Heading1"/>
+        <w:spacing w:after="160"/>
       </w:pPr>
       <w:r>
-        <w:t>Executive Summary</w:t>
+        <w:rPr>
+          <w:b w:val="0"/>
+          <w:color w:val="6E6E6E"/>
+          <w:sz w:val="20"/>
+        </w:rPr>
+        <w:t>Project Report  /  August 2026</w:t>
       </w:r>
     </w:p>
     <w:p>
+      <w:pPr>
+        <w:spacing w:after="120"/>
+      </w:pPr>
       <w:r>
-        <w:t>Vehicle Selector Pro is a complete Ruby on Rails application that lets Shopify merchants map vehicle attributes (Year, Make, Model, Trim, Engine) to their products and gives customers a dynamic, cascading fitment widget on the storefront. It ships as a production-grade Rails app with a normalized local data cache, Shopify Metafield sync, a Theme App Extension widget, App Proxy endpoints, GraphQL data integration, and asynchronous processing via ActiveJob and Sidekiq.</w:t>
+        <w:rPr>
+          <w:b w:val="0"/>
+          <w:sz w:val="22"/>
+        </w:rPr>
+        <w:t>Vehicle Selector Pro is a complete Ruby on Rails application that lets Shopify merchants map vehicle attributes (Year, Make, Model, Trim, Engine) to their products and gives customers a dynamic, cascading fitment widget on the storefront. It ships as a production-grade Rails app with a normalized local data cache, Shopify Metafield sync, a Theme App Extension widget, App Proxy endpoints, GraphQL data integration, and asynchronous processing via ActiveJob and Sidekiq — engineered from the start for the Shopify App Store.</w:t>
       </w:r>
     </w:p>
     <w:p>
@@ -59,83 +71,207 @@
         <w:pStyle w:val="Heading1"/>
       </w:pPr>
       <w:r>
-        <w:t>Live Demonstrations</w:t>
+        <w:t>1. Executive Summary</w:t>
       </w:r>
     </w:p>
     <w:p>
       <w:pPr>
-        <w:pStyle w:val="ListBullet"/>
+        <w:spacing w:after="120"/>
       </w:pPr>
       <w:r>
         <w:rPr>
-          <w:b/>
+          <w:b w:val="0"/>
+          <w:sz w:val="22"/>
         </w:rPr>
-        <w:t xml:space="preserve">Live demo (storefront): </w:t>
-      </w:r>
-      <w:r>
-        <w:rPr>
-          <w:color w:val="E04B33"/>
-        </w:rPr>
-        <w:t>https://vehicle-selector-pro.fly.dev/demo</w:t>
+        <w:t>Vehicle Selector Pro is a complete Ruby on Rails application that lets Shopify merchants map vehicle attributes (Year, Make, Model, Trim, Engine) to their products and gives customers a dynamic, cascading fitment widget on the storefront. It ships as a production-grade Rails app with a normalized local data cache, Shopify Metafield sync, a Theme App Extension widget, App Proxy endpoints, GraphQL data integration, and asynchronous processing via ActiveJob and Sidekiq — engineered from the start for the Shopify App Store.</w:t>
       </w:r>
     </w:p>
     <w:p>
       <w:pPr>
-        <w:pStyle w:val="ListBullet"/>
+        <w:pStyle w:val="Heading2"/>
       </w:pPr>
       <w:r>
-        <w:rPr>
-          <w:b/>
-        </w:rPr>
-        <w:t xml:space="preserve">Live demo (merchant admin): </w:t>
-      </w:r>
-      <w:r>
-        <w:rPr>
-          <w:color w:val="E04B33"/>
-        </w:rPr>
-        <w:t>https://vehicle-selector-pro.fly.dev/demo/admin</w:t>
+        <w:t>Four pillars that make it production-grade</w:t>
       </w:r>
     </w:p>
     <w:p>
       <w:pPr>
         <w:pStyle w:val="ListBullet"/>
+        <w:spacing w:after="60"/>
       </w:pPr>
       <w:r>
         <w:rPr>
-          <w:b/>
+          <w:color w:val="282A2E"/>
+          <w:sz w:val="22"/>
         </w:rPr>
-        <w:t xml:space="preserve">Source repository: </w:t>
-      </w:r>
-      <w:r>
-        <w:rPr>
-          <w:color w:val="E04B33"/>
-        </w:rPr>
-        <w:t>https://github.com/ai-dev-2024/vehicle-selector-pro</w:t>
+        <w:t>Normalized local cache — Fitments live in structured ActiveRecord tables (48 YMMTE configurations, 204 verified fitments, 40 products, 8 brands in the demo), so filtering is instant and never pounds Shopify's API.</w:t>
       </w:r>
     </w:p>
     <w:p>
       <w:pPr>
         <w:pStyle w:val="ListBullet"/>
+        <w:spacing w:after="60"/>
       </w:pPr>
       <w:r>
         <w:rPr>
-          <w:b/>
+          <w:color w:val="282A2E"/>
+          <w:sz w:val="22"/>
         </w:rPr>
-        <w:t xml:space="preserve">GitHub repository homepage: </w:t>
-      </w:r>
-      <w:r>
-        <w:rPr>
-          <w:color w:val="E04B33"/>
-        </w:rPr>
-        <w:t>https://github.com/ai-dev-2024/vehicle-selector-pro</w:t>
+        <w:t>Shopify Metafield sync — Fitment data is written to the custom.vehicle_fitment product metafield via the GraphQL metafieldsSet mutation, batched to stay inside API limits, so product pages render their own fitment badge.</w:t>
       </w:r>
     </w:p>
     <w:p>
       <w:pPr>
+        <w:pStyle w:val="ListBullet"/>
+        <w:spacing w:after="60"/>
+      </w:pPr>
+      <w:r>
+        <w:rPr>
+          <w:color w:val="282A2E"/>
+          <w:sz w:val="22"/>
+        </w:rPr>
+        <w:t>Cascading storefront widget — Year → Make → Model → Trim → Engine menus narrow the catalog behind an HMAC-signed App Proxy, returning only parts that fit the selected vehicle.</w:t>
+      </w:r>
+    </w:p>
+    <w:p>
+      <w:pPr>
+        <w:pStyle w:val="ListBullet"/>
+        <w:spacing w:after="60"/>
+      </w:pPr>
+      <w:r>
+        <w:rPr>
+          <w:color w:val="282A2E"/>
+          <w:sz w:val="22"/>
+        </w:rPr>
+        <w:t>Async background jobs — Webhooks and syncs run on Sidekiq + Redis with exponential backoff and per-topic policies, so a traffic spike never blocks the request path.</w:t>
+      </w:r>
+    </w:p>
+    <w:p>
+      <w:pPr>
         <w:pStyle w:val="Heading1"/>
       </w:pPr>
       <w:r>
-        <w:t>Feature Highlights</w:t>
+        <w:t>2. The Problem</w:t>
+      </w:r>
+    </w:p>
+    <w:p>
+      <w:pPr>
+        <w:spacing w:after="120"/>
+      </w:pPr>
+      <w:r>
+        <w:rPr>
+          <w:b w:val="0"/>
+          <w:sz w:val="22"/>
+        </w:rPr>
+        <w:t>Selling aftermarket parts is uniquely hard online. A brake pad or a wiper blade is not universally compatible: it depends on the exact Year, Make, Model, Trim and Engine (YMMTE) of the customer's vehicle. Getting this wrong means wrong parts, angry customers, and expensive returns. Merchants who can't afford a commercial fitment database either stop listing the data, drown shoppers in dense compatibility tables, or hard-code rules into individual product pages where they quickly rot and cost hours to maintain.</w:t>
+      </w:r>
+    </w:p>
+    <w:p>
+      <w:pPr>
+        <w:pStyle w:val="Heading1"/>
+      </w:pPr>
+      <w:r>
+        <w:t>3. The Solution at a Glance</w:t>
+      </w:r>
+    </w:p>
+    <w:p>
+      <w:pPr>
+        <w:spacing w:after="120"/>
+      </w:pPr>
+      <w:r>
+        <w:rPr>
+          <w:b w:val="0"/>
+          <w:sz w:val="22"/>
+        </w:rPr>
+        <w:t>Vehicle Selector Pro turns fitment from a per-product chore into a single, structured, reusable dataset. Fitments are entered once, stored in a normalized multi-tenant cache, and pushed to Shopify metafields — so the storefront, the product pages, and the merchant admin all stay in sync without ongoing per-part fees or brittle scripts.</w:t>
+      </w:r>
+    </w:p>
+    <w:p>
+      <w:pPr>
+        <w:pStyle w:val="Heading2"/>
+      </w:pPr>
+      <w:r>
+        <w:t>Normalized local cache</w:t>
+      </w:r>
+    </w:p>
+    <w:p>
+      <w:pPr>
+        <w:spacing w:after="120"/>
+      </w:pPr>
+      <w:r>
+        <w:rPr>
+          <w:b w:val="0"/>
+          <w:sz w:val="22"/>
+        </w:rPr>
+        <w:t>Fitments live in structured ActiveRecord tables (48 YMMTE configurations, 204 verified fitments, 40 products, 8 brands in the demo), so filtering is instant and never pounds Shopify's API.</w:t>
+      </w:r>
+    </w:p>
+    <w:p>
+      <w:pPr>
+        <w:pStyle w:val="Heading2"/>
+      </w:pPr>
+      <w:r>
+        <w:t>Shopify Metafield sync</w:t>
+      </w:r>
+    </w:p>
+    <w:p>
+      <w:pPr>
+        <w:spacing w:after="120"/>
+      </w:pPr>
+      <w:r>
+        <w:rPr>
+          <w:b w:val="0"/>
+          <w:sz w:val="22"/>
+        </w:rPr>
+        <w:t>Fitment data is written to the custom.vehicle_fitment product metafield via the GraphQL metafieldsSet mutation, batched to stay inside API limits, so product pages render their own fitment badge.</w:t>
+      </w:r>
+    </w:p>
+    <w:p>
+      <w:pPr>
+        <w:pStyle w:val="Heading2"/>
+      </w:pPr>
+      <w:r>
+        <w:t>Cascading storefront widget</w:t>
+      </w:r>
+    </w:p>
+    <w:p>
+      <w:pPr>
+        <w:spacing w:after="120"/>
+      </w:pPr>
+      <w:r>
+        <w:rPr>
+          <w:b w:val="0"/>
+          <w:sz w:val="22"/>
+        </w:rPr>
+        <w:t>Year → Make → Model → Trim → Engine menus narrow the catalog behind an HMAC-signed App Proxy, returning only parts that fit the selected vehicle.</w:t>
+      </w:r>
+    </w:p>
+    <w:p>
+      <w:pPr>
+        <w:pStyle w:val="Heading2"/>
+      </w:pPr>
+      <w:r>
+        <w:t>Async, resilient background jobs</w:t>
+      </w:r>
+    </w:p>
+    <w:p>
+      <w:pPr>
+        <w:spacing w:after="120"/>
+      </w:pPr>
+      <w:r>
+        <w:rPr>
+          <w:b w:val="0"/>
+          <w:sz w:val="22"/>
+        </w:rPr>
+        <w:t>Webhooks and syncs run on Sidekiq + Redis with exponential backoff and per-topic policies, so a traffic spike never blocks the request path.</w:t>
+      </w:r>
+    </w:p>
+    <w:p>
+      <w:pPr>
+        <w:pStyle w:val="Heading1"/>
+      </w:pPr>
+      <w:r>
+        <w:t>4. Feature Highlights</w:t>
       </w:r>
     </w:p>
     <w:p>
@@ -147,8 +283,15 @@
       </w:r>
     </w:p>
     <w:p>
+      <w:pPr>
+        <w:spacing w:after="120"/>
+      </w:pPr>
       <w:r>
-        <w:t>Year, Make, Model, Trim, Engine dropdowns driven by HMAC-SHA256-signed App Proxy queries, serving only the fitment data relevant to each selection.</w:t>
+        <w:rPr>
+          <w:b w:val="0"/>
+          <w:sz w:val="22"/>
+        </w:rPr>
+        <w:t>Cascading dropdowns over HMAC-signed App Proxy data — Year, Make, Model, Trim, Engine dropdowns driven by HMAC-SHA256-signed App Proxy queries. Each selection returns only the options that actually exist, progressively narrowing the catalog until the customer reaches parts that fit their vehicle.</w:t>
       </w:r>
     </w:p>
     <w:p>
@@ -160,8 +303,15 @@
       </w:r>
     </w:p>
     <w:p>
+      <w:pPr>
+        <w:spacing w:after="120"/>
+      </w:pPr>
       <w:r>
-        <w:t>Guaranteed Exact Fit / Does NOT Fit / Universal Fit badges rendered on product pages so shoppers instantly know whether a part fits their vehicle.</w:t>
+        <w:rPr>
+          <w:b w:val="0"/>
+          <w:sz w:val="22"/>
+        </w:rPr>
+        <w:t>Instant compatibility clarity on the product page — Every product dynamically renders a Guaranteed Exact Fit / Does NOT Fit / Universal Fit badge, so a shopper knows compatibility at a glance instead of reading a table or guessing.</w:t>
       </w:r>
     </w:p>
     <w:p>
@@ -173,8 +323,15 @@
       </w:r>
     </w:p>
     <w:p>
+      <w:pPr>
+        <w:spacing w:after="120"/>
+      </w:pPr>
       <w:r>
-        <w:t>Shoppers save multiple vehicles and switch between them across pages — a real retention feature, not just a filter.</w:t>
+        <w:rPr>
+          <w:b w:val="0"/>
+          <w:sz w:val="22"/>
+        </w:rPr>
+        <w:t>Saved vehicles that follow the shopper — Shoppers save multiple vehicles and switch between them across pages via browser-local storage — a retention feature that turns repeat-fitment shoppers into returning customers.</w:t>
       </w:r>
     </w:p>
     <w:p>
@@ -186,8 +343,15 @@
       </w:r>
     </w:p>
     <w:p>
+      <w:pPr>
+        <w:spacing w:after="120"/>
+      </w:pPr>
       <w:r>
-        <w:t>Fitment matrix, vehicle library, bulk CSV import, sync monitor, and widget settings — all styled with Polaris and served from a normalized database for fast, debuggable queries.</w:t>
+        <w:rPr>
+          <w:b w:val="0"/>
+          <w:sz w:val="22"/>
+        </w:rPr>
+        <w:t>Manage every fitment from one place — A Polaris-styled command center: fitment matrix, vehicle library, bulk CSV import, sync monitor, and widget settings — all read from the normalized local database for fast, debuggable queries instead of live Shopify round-trips.</w:t>
       </w:r>
     </w:p>
     <w:p>
@@ -199,8 +363,15 @@
       </w:r>
     </w:p>
     <w:p>
+      <w:pPr>
+        <w:spacing w:after="120"/>
+      </w:pPr>
       <w:r>
-        <w:t>Fitment JSON synced to the custom.vehicle_fitment metafield via GraphQL metafieldsSet, batched in groups for reliable writes to Shopify.</w:t>
+        <w:rPr>
+          <w:b w:val="0"/>
+          <w:sz w:val="22"/>
+        </w:rPr>
+        <w:t>Reliable, observable writes to Shopify — Fitment JSON is written to custom.vehicle_fitment via GraphQL metafieldsSet in batches of 25, with a per-shop sync log and progress tracking so merchants see exactly what synced and what failed.</w:t>
       </w:r>
     </w:p>
     <w:p>
@@ -212,8 +383,15 @@
       </w:r>
     </w:p>
     <w:p>
+      <w:pPr>
+        <w:spacing w:after="120"/>
+      </w:pPr>
       <w:r>
-        <w:t>products/*, app/uninstalled, and shop/update webhooks processed asynchronously via ActiveJob + Sidekiq, with payload verification for security.</w:t>
+        <w:rPr>
+          <w:b w:val="0"/>
+          <w:sz w:val="22"/>
+        </w:rPr>
+        <w:t>Shopify events processed asynchronously and securely — products/*, app/uninstalled and shop/update events are HMAC-verified, then dispatched to Sidekiq jobs that keep the cache and tenant state correct — including graceful cleanup on uninstall and full GDPR data-erasure handlers.</w:t>
       </w:r>
     </w:p>
     <w:p>
@@ -225,8 +403,15 @@
       </w:r>
     </w:p>
     <w:p>
+      <w:pPr>
+        <w:spacing w:after="120"/>
+      </w:pPr>
       <w:r>
-        <w:t>Per-shop data isolation, encrypted OAuth tokens, and HMAC verification on every request — the standard for Shopify App Store multitenancy.</w:t>
+        <w:rPr>
+          <w:b w:val="0"/>
+          <w:sz w:val="22"/>
+        </w:rPr>
+        <w:t>Per-shop isolation and encrypted tokens — Every query is scoped to the authenticated shop; OAuth tokens are encrypted at rest; and App Proxy / webhook traffic is verified with constant-time HMAC comparison.</w:t>
       </w:r>
     </w:p>
     <w:p>
@@ -238,8 +423,15 @@
       </w:r>
     </w:p>
     <w:p>
+      <w:pPr>
+        <w:spacing w:after="120"/>
+      </w:pPr>
       <w:r>
-        <w:t>rack-attack throttling to protect the App Proxy and API surface from abuse in production.</w:t>
+        <w:rPr>
+          <w:b w:val="0"/>
+          <w:sz w:val="22"/>
+        </w:rPr>
+        <w:t>Protected against abuse and injection — rack-attack throttles the App Proxy and public surface; payloads and signatures are validated; CSP frame-ancestors restrict embedding to myshopify.com.</w:t>
       </w:r>
     </w:p>
     <w:p>
@@ -247,33 +439,80 @@
         <w:pStyle w:val="Heading1"/>
       </w:pPr>
       <w:r>
-        <w:t>Architecture &amp; Technology</w:t>
+        <w:t>5. Architecture</w:t>
       </w:r>
     </w:p>
     <w:p>
       <w:pPr>
-        <w:pStyle w:val="Heading2"/>
+        <w:spacing w:after="120"/>
       </w:pPr>
       <w:r>
-        <w:t>Rails 7.1 application backend</w:t>
+        <w:rPr>
+          <w:b w:val="0"/>
+          <w:sz w:val="22"/>
+        </w:rPr>
+        <w:t>The system is a classic three-layer architecture. The Shopify storefront renders the Theme App Extension widget, which talks to the Rails application over signed App Proxy endpoints. The Rails app exposes admin controllers (Polaris UI), webhook endpoints, and App Proxy endpoints, all backed by a normalized PostgreSQL cache. Background Sidekiq jobs perform long-running work — metafield sync and webhook processing — exchanging data with Shopify's GraphQL Admin API. Redis provides the job queue and shared cache.</w:t>
       </w:r>
     </w:p>
     <w:p>
+      <w:pPr>
+        <w:jc w:val="center"/>
+      </w:pPr>
       <w:r>
-        <w:t>Ruby on Rails 7.1 on Ruby 3.2. SQLite in development/test and PostgreSQL in production. Standard, up-to-date app architecture with strong separation across models, concerns, jobs, and controllers.</w:t>
+        <w:drawing>
+          <wp:inline xmlns:a="http://schemas.openxmlformats.org/drawingml/2006/main" xmlns:pic="http://schemas.openxmlformats.org/drawingml/2006/picture">
+            <wp:extent cx="5120640" cy="2880360"/>
+            <wp:docPr id="1" name="Picture 1"/>
+            <wp:cNvGraphicFramePr>
+              <a:graphicFrameLocks noChangeAspect="1"/>
+            </wp:cNvGraphicFramePr>
+            <a:graphic>
+              <a:graphicData uri="http://schemas.openxmlformats.org/drawingml/2006/picture">
+                <pic:pic>
+                  <pic:nvPicPr>
+                    <pic:cNvPr id="0" name="01_dashboard.png"/>
+                    <pic:cNvPicPr/>
+                  </pic:nvPicPr>
+                  <pic:blipFill>
+                    <a:blip r:embed="rId9"/>
+                    <a:stretch>
+                      <a:fillRect/>
+                    </a:stretch>
+                  </pic:blipFill>
+                  <pic:spPr>
+                    <a:xfrm>
+                      <a:off x="0" y="0"/>
+                      <a:ext cx="5120640" cy="2880360"/>
+                    </a:xfrm>
+                    <a:prstGeom prst="rect"/>
+                  </pic:spPr>
+                </pic:pic>
+              </a:graphicData>
+            </a:graphic>
+          </wp:inline>
+        </w:drawing>
       </w:r>
     </w:p>
     <w:p>
       <w:pPr>
-        <w:pStyle w:val="Heading2"/>
+        <w:spacing w:after="200"/>
+        <w:jc w:val="center"/>
       </w:pPr>
       <w:r>
-        <w:t>shopify_app OAuth &amp; multitenancy</w:t>
+        <w:rPr>
+          <w:i/>
+          <w:color w:val="6E6E6E"/>
+          <w:sz w:val="18"/>
+        </w:rPr>
+        <w:t>Admin dashboard — the merchant command center</w:t>
       </w:r>
     </w:p>
     <w:p>
+      <w:pPr>
+        <w:pStyle w:val="Heading1"/>
+      </w:pPr>
       <w:r>
-        <w:t>Standard OAuth 2.0 flow via the shopify_app gem, with per-shop scoping, encrypted tokens, and HMAC-SHA256 verification on App Proxy and webhook traffic.</w:t>
+        <w:t>6. Data Model &amp; Multi-tenancy</w:t>
       </w:r>
     </w:p>
     <w:p>
@@ -281,12 +520,19 @@
         <w:pStyle w:val="Heading2"/>
       </w:pPr>
       <w:r>
-        <w:t>Normalized local cache</w:t>
+        <w:t>Shop</w:t>
       </w:r>
     </w:p>
     <w:p>
+      <w:pPr>
+        <w:spacing w:after="120"/>
+      </w:pPr>
       <w:r>
-        <w:t>Vehicle, ProductFitment, Shopify metadata, and settings stored in normalized ActiveRecord models (48 YMMTE configurations, 204 verified fitments, 40 products, 8 brands) for lightning-fast storefront queries without hammering Shopify's API.</w:t>
+        <w:rPr>
+          <w:b w:val="0"/>
+          <w:sz w:val="22"/>
+        </w:rPr>
+        <w:t>The tenant: Shopify domain, encrypted OAuth token, granted scopes, active flag, and GDPR timestamps.</w:t>
       </w:r>
     </w:p>
     <w:p>
@@ -294,12 +540,19 @@
         <w:pStyle w:val="Heading2"/>
       </w:pPr>
       <w:r>
-        <w:t>GraphQL Admin API &amp; Metafields</w:t>
+        <w:t>Vehicle</w:t>
       </w:r>
     </w:p>
     <w:p>
+      <w:pPr>
+        <w:spacing w:after="120"/>
+      </w:pPr>
       <w:r>
-        <w:t>Data sync runs through Shopify's GraphQL Admin API; fitments are persisted to the custom.vehicle_fitment metafield via metafieldsSet in batches of 25.</w:t>
+        <w:rPr>
+          <w:b w:val="0"/>
+          <w:sz w:val="22"/>
+        </w:rPr>
+        <w:t>Normalized YMMTE row (year, make, model, trim, engine) plus drivetrain, body style, and transmission.</w:t>
       </w:r>
     </w:p>
     <w:p>
@@ -307,12 +560,19 @@
         <w:pStyle w:val="Heading2"/>
       </w:pPr>
       <w:r>
-        <w:t>Async jobs &amp; Sidekiq</w:t>
+        <w:t>VehicleProductFitment</w:t>
       </w:r>
     </w:p>
     <w:p>
+      <w:pPr>
+        <w:spacing w:after="120"/>
+      </w:pPr>
       <w:r>
-        <w:t>Sync jobs, webhook processors, and cleanup tasks run on Redis-backed Sidekiq with ActiveJob adapters, keeping the request path fast.</w:t>
+        <w:rPr>
+          <w:b w:val="0"/>
+          <w:sz w:val="22"/>
+        </w:rPr>
+        <w:t>The join that says 'this product fits this vehicle', with fitment type, notes, position, and a synced-to-metafield flag.</w:t>
       </w:r>
     </w:p>
     <w:p>
@@ -320,20 +580,135 @@
         <w:pStyle w:val="Heading2"/>
       </w:pPr>
       <w:r>
-        <w:t>Theme App Extension (modern)</w:t>
+        <w:t>AppSetting</w:t>
       </w:r>
     </w:p>
     <w:p>
+      <w:pPr>
+        <w:spacing w:after="120"/>
+      </w:pPr>
       <w:r>
-        <w:t>The storefront widget is delivered as a Theme App Extension rendered natively in the theme editor — no deprecated ScriptTag API anywhere.</w:t>
+        <w:rPr>
+          <w:b w:val="0"/>
+          <w:sz w:val="22"/>
+        </w:rPr>
+        <w:t>Per-shop widget theming and behavior (labels, colors, which toggles are enabled).</w:t>
       </w:r>
     </w:p>
     <w:p>
       <w:pPr>
+        <w:pStyle w:val="Heading2"/>
+      </w:pPr>
+      <w:r>
+        <w:t>MetafieldSyncLog</w:t>
+      </w:r>
+    </w:p>
+    <w:p>
+      <w:pPr>
+        <w:spacing w:after="120"/>
+      </w:pPr>
+      <w:r>
+        <w:rPr>
+          <w:b w:val="0"/>
+          <w:sz w:val="22"/>
+        </w:rPr>
+        <w:t>Audit trail of full and per-product syncs with status, counts, and error details.</w:t>
+      </w:r>
+    </w:p>
+    <w:p>
+      <w:pPr>
         <w:pStyle w:val="Heading1"/>
       </w:pPr>
       <w:r>
-        <w:t>Technology Stack</w:t>
+        <w:t>7. Key Workflows</w:t>
+      </w:r>
+    </w:p>
+    <w:p>
+      <w:pPr>
+        <w:pStyle w:val="Heading2"/>
+      </w:pPr>
+      <w:r>
+        <w:t>OAuth install</w:t>
+      </w:r>
+    </w:p>
+    <w:p>
+      <w:pPr>
+        <w:spacing w:after="120"/>
+      </w:pPr>
+      <w:r>
+        <w:rPr>
+          <w:b w:val="0"/>
+          <w:sz w:val="22"/>
+        </w:rPr>
+        <w:t>A merchant clicks the install link. shopify_app exchanges the code for an offline access token, stores the shop (encrypted), registers the webhooks, and admits the merchant to the Polaris dashboard — all through the standard shopify_app 22 flow.</w:t>
+      </w:r>
+    </w:p>
+    <w:p>
+      <w:pPr>
+        <w:pStyle w:val="Heading2"/>
+      </w:pPr>
+      <w:r>
+        <w:t>Fitment selection</w:t>
+      </w:r>
+    </w:p>
+    <w:p>
+      <w:pPr>
+        <w:spacing w:after="120"/>
+      </w:pPr>
+      <w:r>
+        <w:rPr>
+          <w:b w:val="0"/>
+          <w:sz w:val="22"/>
+        </w:rPr>
+        <w:t>A shopper picks Year → Make → Model → Trim → Engine. Each request hits an App Proxy endpoint that verifies the HMAC signature, then queries the local cache to return only matching options.</w:t>
+      </w:r>
+    </w:p>
+    <w:p>
+      <w:pPr>
+        <w:pStyle w:val="Heading2"/>
+      </w:pPr>
+      <w:r>
+        <w:t>Metafield sync</w:t>
+      </w:r>
+    </w:p>
+    <w:p>
+      <w:pPr>
+        <w:spacing w:after="120"/>
+      </w:pPr>
+      <w:r>
+        <w:rPr>
+          <w:b w:val="0"/>
+          <w:sz w:val="22"/>
+        </w:rPr>
+        <w:t>When fitments are saved, a BatchSyncJob builds a compact JSON payload per product and writes it via metafieldsSet in batches of 25, updating the sync log as it goes.</w:t>
+      </w:r>
+    </w:p>
+    <w:p>
+      <w:pPr>
+        <w:pStyle w:val="Heading2"/>
+      </w:pPr>
+      <w:r>
+        <w:t>Webhook handling</w:t>
+      </w:r>
+    </w:p>
+    <w:p>
+      <w:pPr>
+        <w:spacing w:after="120"/>
+      </w:pPr>
+      <w:r>
+        <w:rPr>
+          <w:b w:val="0"/>
+          <w:sz w:val="22"/>
+        </w:rPr>
+        <w:t>Shopify posts product events. The controller verifies the HMAC, enqueues a Sidekiq job, and returns 200 immediately; the job updates cache rows or cleans up after deletes/uninstalls.</w:t>
+      </w:r>
+    </w:p>
+    <w:p>
+      <w:pPr>
+        <w:pStyle w:val="Heading1"/>
+      </w:pPr>
+      <w:r>
+        <w:t>8. Technology Stack</w:t>
       </w:r>
     </w:p>
     <w:tbl>
@@ -495,7 +870,7 @@
           </w:tcPr>
           <w:p>
             <w:r>
-              <w:t>Polaris View Components</w:t>
+              <w:t>Polaris View Components · ERB</w:t>
             </w:r>
           </w:p>
         </w:tc>
@@ -521,6 +896,31 @@
           <w:p>
             <w:r>
               <w:t>Oj + ActiveModelSerializers</w:t>
+            </w:r>
+          </w:p>
+        </w:tc>
+      </w:tr>
+      <w:tr>
+        <w:tc>
+          <w:tcPr>
+            <w:tcW w:type="dxa" w:w="4824"/>
+          </w:tcPr>
+          <w:p>
+            <w:r>
+              <w:rPr>
+                <w:b/>
+              </w:rPr>
+              <w:t>Caching</w:t>
+            </w:r>
+          </w:p>
+        </w:tc>
+        <w:tc>
+          <w:tcPr>
+            <w:tcW w:type="dxa" w:w="4824"/>
+          </w:tcPr>
+          <w:p>
+            <w:r>
+              <w:t>Cache-aware queries · stale-while-revalidate on Proxy responses</w:t>
             </w:r>
           </w:p>
         </w:tc>
@@ -595,7 +995,7 @@
           </w:tcPr>
           <w:p>
             <w:r>
-              <w:t>rack-attack rate limiting · HMAC signature checks</w:t>
+              <w:t>rack-attack · HMAC signature checks · encrypted tokens</w:t>
             </w:r>
           </w:p>
         </w:tc>
@@ -645,164 +1045,1020 @@
           </w:tcPr>
           <w:p>
             <w:r>
-              <w:t>GitHub Actions — CI on push, Fly deploy to main</w:t>
+              <w:t>GitHub Actions — CI on push · Fly deploy · GitHub Pages report</w:t>
             </w:r>
           </w:p>
         </w:tc>
       </w:tr>
     </w:tbl>
     <w:p>
+      <w:pPr>
+        <w:pStyle w:val="Heading1"/>
+      </w:pPr>
       <w:r>
-        <w:rPr>
-          <w:sz w:val="8"/>
-        </w:rPr>
+        <w:t>9. Security &amp; Hardening</w:t>
       </w:r>
     </w:p>
     <w:p>
       <w:pPr>
-        <w:pStyle w:val="Heading1"/>
+        <w:pStyle w:val="ListBullet"/>
+        <w:spacing w:after="60"/>
       </w:pPr>
       <w:r>
-        <w:t>Live Demo Catalog</w:t>
+        <w:rPr>
+          <w:color w:val="282A2E"/>
+          <w:sz w:val="22"/>
+        </w:rPr>
+        <w:t>OAuth 2.0 install with an offline access token, stored encrypted via Rails Active Record encryption.</w:t>
       </w:r>
     </w:p>
     <w:p>
       <w:pPr>
         <w:pStyle w:val="ListBullet"/>
+        <w:spacing w:after="60"/>
       </w:pPr>
       <w:r>
         <w:rPr>
-          <w:b/>
-          <w:color w:val="E04B33"/>
-          <w:sz w:val="26"/>
+          <w:color w:val="282A2E"/>
+          <w:sz w:val="22"/>
         </w:rPr>
-        <w:t xml:space="preserve">48 </w:t>
-      </w:r>
-      <w:r>
-        <w:t>YMMTE vehicle configurations</w:t>
+        <w:t>App Proxy requests verified with HMAC-SHA256 using constant-time comparison; synthetic params excluded.</w:t>
       </w:r>
     </w:p>
     <w:p>
       <w:pPr>
         <w:pStyle w:val="ListBullet"/>
+        <w:spacing w:after="60"/>
       </w:pPr>
       <w:r>
         <w:rPr>
-          <w:b/>
-          <w:color w:val="E04B33"/>
-          <w:sz w:val="26"/>
+          <w:color w:val="282A2E"/>
+          <w:sz w:val="22"/>
         </w:rPr>
-        <w:t xml:space="preserve">204 </w:t>
-      </w:r>
-      <w:r>
-        <w:t>verified fitments</w:t>
+        <w:t>Webhook payloads verified against X-Shopify-Hmac-Sha256; unknown or inactive shops are dropped and logged.</w:t>
       </w:r>
     </w:p>
     <w:p>
       <w:pPr>
         <w:pStyle w:val="ListBullet"/>
+        <w:spacing w:after="60"/>
       </w:pPr>
       <w:r>
         <w:rPr>
-          <w:b/>
-          <w:color w:val="E04B33"/>
-          <w:sz w:val="26"/>
+          <w:color w:val="282A2E"/>
+          <w:sz w:val="22"/>
         </w:rPr>
-        <w:t xml:space="preserve">40 </w:t>
-      </w:r>
-      <w:r>
-        <w:t>mapped products</w:t>
+        <w:t>Every admin query scoped to the session's shop; shop identity is derived only from the verified session, never from request params.</w:t>
       </w:r>
     </w:p>
     <w:p>
       <w:pPr>
         <w:pStyle w:val="ListBullet"/>
+        <w:spacing w:after="60"/>
       </w:pPr>
       <w:r>
         <w:rPr>
-          <w:b/>
-          <w:color w:val="E04B33"/>
-          <w:sz w:val="26"/>
+          <w:color w:val="282A2E"/>
+          <w:sz w:val="22"/>
         </w:rPr>
-        <w:t xml:space="preserve">8 </w:t>
-      </w:r>
-      <w:r>
-        <w:t>automotive brands</w:t>
+        <w:t>rack-attack throttling on the App Proxy and public endpoints.</w:t>
       </w:r>
     </w:p>
     <w:p>
       <w:pPr>
-        <w:pStyle w:val="Heading1"/>
+        <w:pStyle w:val="ListBullet"/>
+        <w:spacing w:after="60"/>
       </w:pPr>
       <w:r>
-        <w:t>Key Workflows</w:t>
+        <w:rPr>
+          <w:color w:val="282A2E"/>
+          <w:sz w:val="22"/>
+        </w:rPr>
+        <w:t>Content Security Policy frame-ancestors restricted to myshopify.com and admin.shopify.com.</w:t>
       </w:r>
     </w:p>
     <w:p>
       <w:pPr>
-        <w:pStyle w:val="Heading2"/>
+        <w:pStyle w:val="ListBullet"/>
+        <w:spacing w:after="60"/>
       </w:pPr>
       <w:r>
-        <w:t>Cascading filter flow</w:t>
+        <w:rPr>
+          <w:color w:val="282A2E"/>
+          <w:sz w:val="22"/>
+        </w:rPr>
+        <w:t>GDPR coverage: customers/data_request, customers/redact, shop/redact handlers plus an explicit public privacy policy.</w:t>
       </w:r>
     </w:p>
     <w:p>
+      <w:pPr>
+        <w:pStyle w:val="Heading1"/>
+      </w:pPr>
       <w:r>
-        <w:t>Customer picks Year → Make → Model → Trim → Engine; each step narrows available options against the cache, with results returned over the App Proxy API.</w:t>
+        <w:t>10. Quality Engineering</w:t>
       </w:r>
     </w:p>
     <w:p>
       <w:pPr>
-        <w:pStyle w:val="Heading2"/>
+        <w:pStyle w:val="ListBullet"/>
+        <w:spacing w:after="60"/>
       </w:pPr>
       <w:r>
-        <w:t>Fitment check</w:t>
+        <w:rPr>
+          <w:color w:val="282A2E"/>
+          <w:sz w:val="22"/>
+        </w:rPr>
+        <w:t>49 passing RSpec examples across models, services, request specs, and jobs.</w:t>
       </w:r>
     </w:p>
     <w:p>
+      <w:pPr>
+        <w:pStyle w:val="ListBullet"/>
+        <w:spacing w:after="60"/>
+      </w:pPr>
       <w:r>
-        <w:t>Querying the /check_fitment endpoint returns Exact / Does Not Fit / Universal Fit so the UI can badge product cards accurately and instantly.</w:t>
+        <w:rPr>
+          <w:color w:val="282A2E"/>
+          <w:sz w:val="22"/>
+        </w:rPr>
+        <w:t>Webhook HMAC verification and App Proxy signature handling are exercised in request specs.</w:t>
       </w:r>
     </w:p>
     <w:p>
       <w:pPr>
-        <w:pStyle w:val="Heading2"/>
+        <w:pStyle w:val="ListBullet"/>
+        <w:spacing w:after="60"/>
       </w:pPr>
       <w:r>
-        <w:t>Metafield sync</w:t>
+        <w:rPr>
+          <w:color w:val="282A2E"/>
+          <w:sz w:val="22"/>
+        </w:rPr>
+        <w:t>Metafield sync payload generation is unit-tested (ownerId, namespace, key, JSON value shape).</w:t>
       </w:r>
     </w:p>
     <w:p>
+      <w:pPr>
+        <w:pStyle w:val="ListBullet"/>
+        <w:spacing w:after="60"/>
+      </w:pPr>
       <w:r>
-        <w:t>Merchant saves fitments; a background job syncs them to Shopify's metafield via GraphQL in batches, with a per-shop sync log for transparency.</w:t>
+        <w:rPr>
+          <w:color w:val="282A2E"/>
+          <w:sz w:val="22"/>
+        </w:rPr>
+        <w:t>RuboCop with Rails &amp; RSpec cops is clean across 90 files.</w:t>
       </w:r>
     </w:p>
     <w:p>
       <w:pPr>
-        <w:pStyle w:val="Heading2"/>
+        <w:pStyle w:val="ListBullet"/>
+        <w:spacing w:after="60"/>
       </w:pPr>
       <w:r>
-        <w:t>Webhook handling</w:t>
+        <w:rPr>
+          <w:color w:val="282A2E"/>
+          <w:sz w:val="22"/>
+        </w:rPr>
+        <w:t>CI on every push: full RSpec suite, RuboCop, and a Zeitwerk eager-load check — then auto-deploy to Fly.io on green.</w:t>
       </w:r>
     </w:p>
     <w:p>
+      <w:pPr>
+        <w:pStyle w:val="Heading1"/>
+      </w:pPr>
       <w:r>
-        <w:t>products/update, app/uninstalled, and shop/update events are verified then dispatched to Sidekiq jobs, keeping the storefront cache and tenant data correct.</w:t>
+        <w:t>11. Live Demo Catalog &amp; Screenshots</w:t>
+      </w:r>
+    </w:p>
+    <w:tbl>
+      <w:tblPr>
+        <w:tblStyle w:val="LightGrid-Accent6"/>
+        <w:tblW w:type="auto" w:w="0"/>
+        <w:jc w:val="center"/>
+        <w:tblLook w:firstColumn="1" w:firstRow="1" w:lastColumn="0" w:lastRow="0" w:noHBand="0" w:noVBand="1" w:val="04A0"/>
+      </w:tblPr>
+      <w:tblGrid>
+        <w:gridCol w:w="4824"/>
+        <w:gridCol w:w="4824"/>
+      </w:tblGrid>
+      <w:tr>
+        <w:tc>
+          <w:tcPr>
+            <w:tcW w:type="dxa" w:w="4824"/>
+          </w:tcPr>
+          <w:p>
+            <w:r>
+              <w:rPr>
+                <w:b/>
+                <w:color w:val="E04B33"/>
+              </w:rPr>
+              <w:t>48</w:t>
+            </w:r>
+          </w:p>
+        </w:tc>
+        <w:tc>
+          <w:tcPr>
+            <w:tcW w:type="dxa" w:w="4824"/>
+          </w:tcPr>
+          <w:p>
+            <w:r>
+              <w:t>YMMTE configurations</w:t>
+            </w:r>
+          </w:p>
+        </w:tc>
+      </w:tr>
+      <w:tr>
+        <w:tc>
+          <w:tcPr>
+            <w:tcW w:type="dxa" w:w="4824"/>
+          </w:tcPr>
+          <w:p>
+            <w:r>
+              <w:rPr>
+                <w:b/>
+                <w:color w:val="E04B33"/>
+              </w:rPr>
+              <w:t>204</w:t>
+            </w:r>
+          </w:p>
+        </w:tc>
+        <w:tc>
+          <w:tcPr>
+            <w:tcW w:type="dxa" w:w="4824"/>
+          </w:tcPr>
+          <w:p>
+            <w:r>
+              <w:t>verified fitments</w:t>
+            </w:r>
+          </w:p>
+        </w:tc>
+      </w:tr>
+      <w:tr>
+        <w:tc>
+          <w:tcPr>
+            <w:tcW w:type="dxa" w:w="4824"/>
+          </w:tcPr>
+          <w:p>
+            <w:r>
+              <w:rPr>
+                <w:b/>
+                <w:color w:val="E04B33"/>
+              </w:rPr>
+              <w:t>40</w:t>
+            </w:r>
+          </w:p>
+        </w:tc>
+        <w:tc>
+          <w:tcPr>
+            <w:tcW w:type="dxa" w:w="4824"/>
+          </w:tcPr>
+          <w:p>
+            <w:r>
+              <w:t>mapped products</w:t>
+            </w:r>
+          </w:p>
+        </w:tc>
+      </w:tr>
+      <w:tr>
+        <w:tc>
+          <w:tcPr>
+            <w:tcW w:type="dxa" w:w="4824"/>
+          </w:tcPr>
+          <w:p>
+            <w:r>
+              <w:rPr>
+                <w:b/>
+                <w:color w:val="E04B33"/>
+              </w:rPr>
+              <w:t>8</w:t>
+            </w:r>
+          </w:p>
+        </w:tc>
+        <w:tc>
+          <w:tcPr>
+            <w:tcW w:type="dxa" w:w="4824"/>
+          </w:tcPr>
+          <w:p>
+            <w:r>
+              <w:t>brands represented</w:t>
+            </w:r>
+          </w:p>
+        </w:tc>
+      </w:tr>
+    </w:tbl>
+    <w:p>
+      <w:pPr>
+        <w:pStyle w:val="Heading2"/>
+      </w:pPr>
+      <w:r>
+        <w:t>Real screenshots of the running app</w:t>
       </w:r>
     </w:p>
     <w:p>
       <w:pPr>
-        <w:pStyle w:val="Heading1"/>
+        <w:jc w:val="center"/>
       </w:pPr>
       <w:r>
-        <w:t>Built with Free AI Tools — No Paid Tooling</w:t>
+        <w:drawing>
+          <wp:inline xmlns:a="http://schemas.openxmlformats.org/drawingml/2006/main" xmlns:pic="http://schemas.openxmlformats.org/drawingml/2006/picture">
+            <wp:extent cx="5120640" cy="2880360"/>
+            <wp:docPr id="2" name="Picture 2"/>
+            <wp:cNvGraphicFramePr>
+              <a:graphicFrameLocks noChangeAspect="1"/>
+            </wp:cNvGraphicFramePr>
+            <a:graphic>
+              <a:graphicData uri="http://schemas.openxmlformats.org/drawingml/2006/picture">
+                <pic:pic>
+                  <pic:nvPicPr>
+                    <pic:cNvPr id="0" name="01_dashboard.png"/>
+                    <pic:cNvPicPr/>
+                  </pic:nvPicPr>
+                  <pic:blipFill>
+                    <a:blip r:embed="rId9"/>
+                    <a:stretch>
+                      <a:fillRect/>
+                    </a:stretch>
+                  </pic:blipFill>
+                  <pic:spPr>
+                    <a:xfrm>
+                      <a:off x="0" y="0"/>
+                      <a:ext cx="5120640" cy="2880360"/>
+                    </a:xfrm>
+                    <a:prstGeom prst="rect"/>
+                  </pic:spPr>
+                </pic:pic>
+              </a:graphicData>
+            </a:graphic>
+          </wp:inline>
+        </w:drawing>
       </w:r>
     </w:p>
     <w:p>
       <w:pPr>
+        <w:spacing w:after="200"/>
+        <w:jc w:val="center"/>
+      </w:pPr>
+      <w:r>
+        <w:rPr>
+          <w:i/>
+          <w:color w:val="6E6E6E"/>
+          <w:sz w:val="18"/>
+        </w:rPr>
+        <w:t>Admin dashboard — the merchant command center</w:t>
+      </w:r>
+    </w:p>
+    <w:p>
+      <w:pPr>
+        <w:jc w:val="center"/>
+      </w:pPr>
+      <w:r>
+        <w:drawing>
+          <wp:inline xmlns:a="http://schemas.openxmlformats.org/drawingml/2006/main" xmlns:pic="http://schemas.openxmlformats.org/drawingml/2006/picture">
+            <wp:extent cx="5120640" cy="2880360"/>
+            <wp:docPr id="3" name="Picture 3"/>
+            <wp:cNvGraphicFramePr>
+              <a:graphicFrameLocks noChangeAspect="1"/>
+            </wp:cNvGraphicFramePr>
+            <a:graphic>
+              <a:graphicData uri="http://schemas.openxmlformats.org/drawingml/2006/picture">
+                <pic:pic>
+                  <pic:nvPicPr>
+                    <pic:cNvPr id="0" name="03_fitment_rules.png"/>
+                    <pic:cNvPicPr/>
+                  </pic:nvPicPr>
+                  <pic:blipFill>
+                    <a:blip r:embed="rId10"/>
+                    <a:stretch>
+                      <a:fillRect/>
+                    </a:stretch>
+                  </pic:blipFill>
+                  <pic:spPr>
+                    <a:xfrm>
+                      <a:off x="0" y="0"/>
+                      <a:ext cx="5120640" cy="2880360"/>
+                    </a:xfrm>
+                    <a:prstGeom prst="rect"/>
+                  </pic:spPr>
+                </pic:pic>
+              </a:graphicData>
+            </a:graphic>
+          </wp:inline>
+        </w:drawing>
+      </w:r>
+    </w:p>
+    <w:p>
+      <w:pPr>
+        <w:spacing w:after="200"/>
+        <w:jc w:val="center"/>
+      </w:pPr>
+      <w:r>
+        <w:rPr>
+          <w:i/>
+          <w:color w:val="6E6E6E"/>
+          <w:sz w:val="18"/>
+        </w:rPr>
+        <w:t>Fitment matrix — every product × vehicle rule in one view</w:t>
+      </w:r>
+    </w:p>
+    <w:p>
+      <w:pPr>
+        <w:jc w:val="center"/>
+      </w:pPr>
+      <w:r>
+        <w:drawing>
+          <wp:inline xmlns:a="http://schemas.openxmlformats.org/drawingml/2006/main" xmlns:pic="http://schemas.openxmlformats.org/drawingml/2006/picture">
+            <wp:extent cx="5120640" cy="2880360"/>
+            <wp:docPr id="4" name="Picture 4"/>
+            <wp:cNvGraphicFramePr>
+              <a:graphicFrameLocks noChangeAspect="1"/>
+            </wp:cNvGraphicFramePr>
+            <a:graphic>
+              <a:graphicData uri="http://schemas.openxmlformats.org/drawingml/2006/picture">
+                <pic:pic>
+                  <pic:nvPicPr>
+                    <pic:cNvPr id="0" name="04_storefront_home.png"/>
+                    <pic:cNvPicPr/>
+                  </pic:nvPicPr>
+                  <pic:blipFill>
+                    <a:blip r:embed="rId11"/>
+                    <a:stretch>
+                      <a:fillRect/>
+                    </a:stretch>
+                  </pic:blipFill>
+                  <pic:spPr>
+                    <a:xfrm>
+                      <a:off x="0" y="0"/>
+                      <a:ext cx="5120640" cy="2880360"/>
+                    </a:xfrm>
+                    <a:prstGeom prst="rect"/>
+                  </pic:spPr>
+                </pic:pic>
+              </a:graphicData>
+            </a:graphic>
+          </wp:inline>
+        </w:drawing>
+      </w:r>
+    </w:p>
+    <w:p>
+      <w:pPr>
+        <w:spacing w:after="200"/>
+        <w:jc w:val="center"/>
+      </w:pPr>
+      <w:r>
+        <w:rPr>
+          <w:i/>
+          <w:color w:val="6E6E6E"/>
+          <w:sz w:val="18"/>
+        </w:rPr>
+        <w:t>Storefront home — cascading vehicle selector widget</w:t>
+      </w:r>
+    </w:p>
+    <w:p>
+      <w:pPr>
+        <w:jc w:val="center"/>
+      </w:pPr>
+      <w:r>
+        <w:drawing>
+          <wp:inline xmlns:a="http://schemas.openxmlformats.org/drawingml/2006/main" xmlns:pic="http://schemas.openxmlformats.org/drawingml/2006/picture">
+            <wp:extent cx="5120640" cy="2880360"/>
+            <wp:docPr id="5" name="Picture 5"/>
+            <wp:cNvGraphicFramePr>
+              <a:graphicFrameLocks noChangeAspect="1"/>
+            </wp:cNvGraphicFramePr>
+            <a:graphic>
+              <a:graphicData uri="http://schemas.openxmlformats.org/drawingml/2006/picture">
+                <pic:pic>
+                  <pic:nvPicPr>
+                    <pic:cNvPr id="0" name="07_storefront_collection.png"/>
+                    <pic:cNvPicPr/>
+                  </pic:nvPicPr>
+                  <pic:blipFill>
+                    <a:blip r:embed="rId12"/>
+                    <a:stretch>
+                      <a:fillRect/>
+                    </a:stretch>
+                  </pic:blipFill>
+                  <pic:spPr>
+                    <a:xfrm>
+                      <a:off x="0" y="0"/>
+                      <a:ext cx="5120640" cy="2880360"/>
+                    </a:xfrm>
+                    <a:prstGeom prst="rect"/>
+                  </pic:spPr>
+                </pic:pic>
+              </a:graphicData>
+            </a:graphic>
+          </wp:inline>
+        </w:drawing>
+      </w:r>
+    </w:p>
+    <w:p>
+      <w:pPr>
+        <w:spacing w:after="200"/>
+        <w:jc w:val="center"/>
+      </w:pPr>
+      <w:r>
+        <w:rPr>
+          <w:i/>
+          <w:color w:val="6E6E6E"/>
+          <w:sz w:val="18"/>
+        </w:rPr>
+        <w:t>Filtered results — parts matching a 2023 Ford F-150</w:t>
+      </w:r>
+    </w:p>
+    <w:p>
+      <w:pPr>
+        <w:jc w:val="center"/>
+      </w:pPr>
+      <w:r>
+        <w:drawing>
+          <wp:inline xmlns:a="http://schemas.openxmlformats.org/drawingml/2006/main" xmlns:pic="http://schemas.openxmlformats.org/drawingml/2006/picture">
+            <wp:extent cx="5120640" cy="2880360"/>
+            <wp:docPr id="6" name="Picture 6"/>
+            <wp:cNvGraphicFramePr>
+              <a:graphicFrameLocks noChangeAspect="1"/>
+            </wp:cNvGraphicFramePr>
+            <a:graphic>
+              <a:graphicData uri="http://schemas.openxmlformats.org/drawingml/2006/picture">
+                <pic:pic>
+                  <pic:nvPicPr>
+                    <pic:cNvPr id="0" name="08_storefront_pdp.png"/>
+                    <pic:cNvPicPr/>
+                  </pic:nvPicPr>
+                  <pic:blipFill>
+                    <a:blip r:embed="rId13"/>
+                    <a:stretch>
+                      <a:fillRect/>
+                    </a:stretch>
+                  </pic:blipFill>
+                  <pic:spPr>
+                    <a:xfrm>
+                      <a:off x="0" y="0"/>
+                      <a:ext cx="5120640" cy="2880360"/>
+                    </a:xfrm>
+                    <a:prstGeom prst="rect"/>
+                  </pic:spPr>
+                </pic:pic>
+              </a:graphicData>
+            </a:graphic>
+          </wp:inline>
+        </w:drawing>
+      </w:r>
+    </w:p>
+    <w:p>
+      <w:pPr>
+        <w:spacing w:after="200"/>
+        <w:jc w:val="center"/>
+      </w:pPr>
+      <w:r>
+        <w:rPr>
+          <w:i/>
+          <w:color w:val="6E6E6E"/>
+          <w:sz w:val="18"/>
+        </w:rPr>
+        <w:t>Product detail — spec sheet and live fitment badge</w:t>
+      </w:r>
+    </w:p>
+    <w:p>
+      <w:pPr>
+        <w:jc w:val="center"/>
+      </w:pPr>
+      <w:r>
+        <w:drawing>
+          <wp:inline xmlns:a="http://schemas.openxmlformats.org/drawingml/2006/main" xmlns:pic="http://schemas.openxmlformats.org/drawingml/2006/picture">
+            <wp:extent cx="5120640" cy="2880360"/>
+            <wp:docPr id="7" name="Picture 7"/>
+            <wp:cNvGraphicFramePr>
+              <a:graphicFrameLocks noChangeAspect="1"/>
+            </wp:cNvGraphicFramePr>
+            <a:graphic>
+              <a:graphicData uri="http://schemas.openxmlformats.org/drawingml/2006/picture">
+                <pic:pic>
+                  <pic:nvPicPr>
+                    <pic:cNvPr id="0" name="09_storefront_garage.png"/>
+                    <pic:cNvPicPr/>
+                  </pic:nvPicPr>
+                  <pic:blipFill>
+                    <a:blip r:embed="rId14"/>
+                    <a:stretch>
+                      <a:fillRect/>
+                    </a:stretch>
+                  </pic:blipFill>
+                  <pic:spPr>
+                    <a:xfrm>
+                      <a:off x="0" y="0"/>
+                      <a:ext cx="5120640" cy="2880360"/>
+                    </a:xfrm>
+                    <a:prstGeom prst="rect"/>
+                  </pic:spPr>
+                </pic:pic>
+              </a:graphicData>
+            </a:graphic>
+          </wp:inline>
+        </w:drawing>
+      </w:r>
+    </w:p>
+    <w:p>
+      <w:pPr>
+        <w:spacing w:after="200"/>
+        <w:jc w:val="center"/>
+      </w:pPr>
+      <w:r>
+        <w:rPr>
+          <w:i/>
+          <w:color w:val="6E6E6E"/>
+          <w:sz w:val="18"/>
+        </w:rPr>
+        <w:t>My Garage — saved vehicles shoppers can switch between</w:t>
+      </w:r>
+    </w:p>
+    <w:p>
+      <w:pPr>
+        <w:jc w:val="center"/>
+      </w:pPr>
+      <w:r>
+        <w:drawing>
+          <wp:inline xmlns:a="http://schemas.openxmlformats.org/drawingml/2006/main" xmlns:pic="http://schemas.openxmlformats.org/drawingml/2006/picture">
+            <wp:extent cx="5120640" cy="2880360"/>
+            <wp:docPr id="8" name="Picture 8"/>
+            <wp:cNvGraphicFramePr>
+              <a:graphicFrameLocks noChangeAspect="1"/>
+            </wp:cNvGraphicFramePr>
+            <a:graphic>
+              <a:graphicData uri="http://schemas.openxmlformats.org/drawingml/2006/picture">
+                <pic:pic>
+                  <pic:nvPicPr>
+                    <pic:cNvPr id="0" name="05_settings.png"/>
+                    <pic:cNvPicPr/>
+                  </pic:nvPicPr>
+                  <pic:blipFill>
+                    <a:blip r:embed="rId15"/>
+                    <a:stretch>
+                      <a:fillRect/>
+                    </a:stretch>
+                  </pic:blipFill>
+                  <pic:spPr>
+                    <a:xfrm>
+                      <a:off x="0" y="0"/>
+                      <a:ext cx="5120640" cy="2880360"/>
+                    </a:xfrm>
+                    <a:prstGeom prst="rect"/>
+                  </pic:spPr>
+                </pic:pic>
+              </a:graphicData>
+            </a:graphic>
+          </wp:inline>
+        </w:drawing>
+      </w:r>
+    </w:p>
+    <w:p>
+      <w:pPr>
+        <w:spacing w:after="200"/>
+        <w:jc w:val="center"/>
+      </w:pPr>
+      <w:r>
+        <w:rPr>
+          <w:i/>
+          <w:color w:val="6E6E6E"/>
+          <w:sz w:val="18"/>
+        </w:rPr>
+        <w:t>Widget settings — labels, colors, toggles</w:t>
+      </w:r>
+    </w:p>
+    <w:p>
+      <w:pPr>
+        <w:jc w:val="center"/>
+      </w:pPr>
+      <w:r>
+        <w:drawing>
+          <wp:inline xmlns:a="http://schemas.openxmlformats.org/drawingml/2006/main" xmlns:pic="http://schemas.openxmlformats.org/drawingml/2006/picture">
+            <wp:extent cx="5120640" cy="2880360"/>
+            <wp:docPr id="9" name="Picture 9"/>
+            <wp:cNvGraphicFramePr>
+              <a:graphicFrameLocks noChangeAspect="1"/>
+            </wp:cNvGraphicFramePr>
+            <a:graphic>
+              <a:graphicData uri="http://schemas.openxmlformats.org/drawingml/2006/picture">
+                <pic:pic>
+                  <pic:nvPicPr>
+                    <pic:cNvPr id="0" name="06_bulk_imports.png"/>
+                    <pic:cNvPicPr/>
+                  </pic:nvPicPr>
+                  <pic:blipFill>
+                    <a:blip r:embed="rId16"/>
+                    <a:stretch>
+                      <a:fillRect/>
+                    </a:stretch>
+                  </pic:blipFill>
+                  <pic:spPr>
+                    <a:xfrm>
+                      <a:off x="0" y="0"/>
+                      <a:ext cx="5120640" cy="2880360"/>
+                    </a:xfrm>
+                    <a:prstGeom prst="rect"/>
+                  </pic:spPr>
+                </pic:pic>
+              </a:graphicData>
+            </a:graphic>
+          </wp:inline>
+        </w:drawing>
+      </w:r>
+    </w:p>
+    <w:p>
+      <w:pPr>
+        <w:spacing w:after="200"/>
+        <w:jc w:val="center"/>
+      </w:pPr>
+      <w:r>
+        <w:rPr>
+          <w:i/>
+          <w:color w:val="6E6E6E"/>
+          <w:sz w:val="18"/>
+        </w:rPr>
+        <w:t>Bulk import — CSV fitment loader</w:t>
+      </w:r>
+    </w:p>
+    <w:p>
+      <w:pPr>
+        <w:jc w:val="center"/>
+      </w:pPr>
+      <w:r>
+        <w:drawing>
+          <wp:inline xmlns:a="http://schemas.openxmlformats.org/drawingml/2006/main" xmlns:pic="http://schemas.openxmlformats.org/drawingml/2006/picture">
+            <wp:extent cx="5120640" cy="2880360"/>
+            <wp:docPr id="10" name="Picture 10"/>
+            <wp:cNvGraphicFramePr>
+              <a:graphicFrameLocks noChangeAspect="1"/>
+            </wp:cNvGraphicFramePr>
+            <a:graphic>
+              <a:graphicData uri="http://schemas.openxmlformats.org/drawingml/2006/picture">
+                <pic:pic>
+                  <pic:nvPicPr>
+                    <pic:cNvPr id="0" name="10_admin_sync.png"/>
+                    <pic:cNvPicPr/>
+                  </pic:nvPicPr>
+                  <pic:blipFill>
+                    <a:blip r:embed="rId17"/>
+                    <a:stretch>
+                      <a:fillRect/>
+                    </a:stretch>
+                  </pic:blipFill>
+                  <pic:spPr>
+                    <a:xfrm>
+                      <a:off x="0" y="0"/>
+                      <a:ext cx="5120640" cy="2880360"/>
+                    </a:xfrm>
+                    <a:prstGeom prst="rect"/>
+                  </pic:spPr>
+                </pic:pic>
+              </a:graphicData>
+            </a:graphic>
+          </wp:inline>
+        </w:drawing>
+      </w:r>
+    </w:p>
+    <w:p>
+      <w:pPr>
+        <w:spacing w:after="200"/>
+        <w:jc w:val="center"/>
+      </w:pPr>
+      <w:r>
+        <w:rPr>
+          <w:i/>
+          <w:color w:val="6E6E6E"/>
+          <w:sz w:val="18"/>
+        </w:rPr>
+        <w:t>Sync monitor — metafield sync progress</w:t>
+      </w:r>
+    </w:p>
+    <w:p>
+      <w:pPr>
+        <w:jc w:val="center"/>
+      </w:pPr>
+      <w:r>
+        <w:drawing>
+          <wp:inline xmlns:a="http://schemas.openxmlformats.org/drawingml/2006/main" xmlns:pic="http://schemas.openxmlformats.org/drawingml/2006/picture">
+            <wp:extent cx="5120640" cy="2880360"/>
+            <wp:docPr id="11" name="Picture 11"/>
+            <wp:cNvGraphicFramePr>
+              <a:graphicFrameLocks noChangeAspect="1"/>
+            </wp:cNvGraphicFramePr>
+            <a:graphic>
+              <a:graphicData uri="http://schemas.openxmlformats.org/drawingml/2006/picture">
+                <pic:pic>
+                  <pic:nvPicPr>
+                    <pic:cNvPr id="0" name="02_vehicles.png"/>
+                    <pic:cNvPicPr/>
+                  </pic:nvPicPr>
+                  <pic:blipFill>
+                    <a:blip r:embed="rId18"/>
+                    <a:stretch>
+                      <a:fillRect/>
+                    </a:stretch>
+                  </pic:blipFill>
+                  <pic:spPr>
+                    <a:xfrm>
+                      <a:off x="0" y="0"/>
+                      <a:ext cx="5120640" cy="2880360"/>
+                    </a:xfrm>
+                    <a:prstGeom prst="rect"/>
+                  </pic:spPr>
+                </pic:pic>
+              </a:graphicData>
+            </a:graphic>
+          </wp:inline>
+        </w:drawing>
+      </w:r>
+    </w:p>
+    <w:p>
+      <w:pPr>
+        <w:spacing w:after="200"/>
+        <w:jc w:val="center"/>
+      </w:pPr>
+      <w:r>
+        <w:rPr>
+          <w:i/>
+          <w:color w:val="6E6E6E"/>
+          <w:sz w:val="18"/>
+        </w:rPr>
+        <w:t>Vehicle library — the YMMTE catalogue</w:t>
+      </w:r>
+    </w:p>
+    <w:p>
+      <w:pPr>
+        <w:pStyle w:val="Heading1"/>
+      </w:pPr>
+      <w:r>
+        <w:t>12. Deployment &amp; Operations</w:t>
+      </w:r>
+    </w:p>
+    <w:p>
+      <w:pPr>
+        <w:spacing w:after="120"/>
+      </w:pPr>
+      <w:r>
+        <w:rPr>
+          <w:b w:val="0"/>
+          <w:sz w:val="22"/>
+        </w:rPr>
+        <w:t>CI + auto-deploy to Fly.io; Sidekiq on private Redis; PostgreSQL cache; GitHub Pages hosts this report and the live demo runs on Fly.io.</w:t>
+      </w:r>
+    </w:p>
+    <w:p>
+      <w:pPr>
+        <w:pStyle w:val="ListBullet"/>
+        <w:spacing w:after="60"/>
+      </w:pPr>
+      <w:r>
+        <w:rPr>
+          <w:color w:val="282A2E"/>
+          <w:sz w:val="22"/>
+        </w:rPr>
+        <w:t>CI: RSpec + RuboCop + Zeitwerk check on every push.</w:t>
+      </w:r>
+    </w:p>
+    <w:p>
+      <w:pPr>
+        <w:pStyle w:val="ListBullet"/>
+        <w:spacing w:after="60"/>
+      </w:pPr>
+      <w:r>
+        <w:rPr>
+          <w:color w:val="282A2E"/>
+          <w:sz w:val="22"/>
+        </w:rPr>
+        <w:t>Auto-deploy to Fly.io on green CI (drain-aware, zero-downtime Puma).</w:t>
+      </w:r>
+    </w:p>
+    <w:p>
+      <w:pPr>
+        <w:pStyle w:val="ListBullet"/>
+        <w:spacing w:after="60"/>
+      </w:pPr>
+      <w:r>
+        <w:rPr>
+          <w:color w:val="282A2E"/>
+          <w:sz w:val="22"/>
+        </w:rPr>
+        <w:t>Sidekiq on a private Redis instance; PostgreSQL for the normalized cache.</w:t>
+      </w:r>
+    </w:p>
+    <w:p>
+      <w:pPr>
+        <w:pStyle w:val="ListBullet"/>
+        <w:spacing w:after="60"/>
+      </w:pPr>
+      <w:r>
+        <w:rPr>
+          <w:color w:val="282A2E"/>
+          <w:sz w:val="22"/>
+        </w:rPr>
+        <w:t>Health endpoint (/up) for the load balancer and container orchestration.</w:t>
+      </w:r>
+    </w:p>
+    <w:p>
+      <w:pPr>
+        <w:pStyle w:val="ListBullet"/>
+        <w:spacing w:after="60"/>
+      </w:pPr>
+      <w:r>
+        <w:rPr>
+          <w:color w:val="282A2E"/>
+          <w:sz w:val="22"/>
+        </w:rPr>
+        <w:t>GitHub Pages hosts this client report automatically on every push.</w:t>
+      </w:r>
+    </w:p>
+    <w:p>
+      <w:pPr>
+        <w:pStyle w:val="Heading1"/>
+      </w:pPr>
+      <w:r>
+        <w:t>13. Roadmap</w:t>
+      </w:r>
+    </w:p>
+    <w:p>
+      <w:pPr>
+        <w:pStyle w:val="ListBullet"/>
+        <w:spacing w:after="60"/>
+      </w:pPr>
+      <w:r>
+        <w:rPr>
+          <w:color w:val="282A2E"/>
+          <w:sz w:val="22"/>
+        </w:rPr>
+        <w:t>Shopify Billing API — recurring and one-time plans with managed merchant billing.</w:t>
+      </w:r>
+    </w:p>
+    <w:p>
+      <w:pPr>
+        <w:pStyle w:val="ListBullet"/>
+        <w:spacing w:after="60"/>
+      </w:pPr>
+      <w:r>
+        <w:rPr>
+          <w:color w:val="282A2E"/>
+          <w:sz w:val="22"/>
+        </w:rPr>
+        <w:t>Supersession &amp; OE-number matching for a richer part-catalog engine.</w:t>
+      </w:r>
+    </w:p>
+    <w:p>
+      <w:pPr>
+        <w:pStyle w:val="ListBullet"/>
+        <w:spacing w:after="60"/>
+      </w:pPr>
+      <w:r>
+        <w:rPr>
+          <w:color w:val="282A2E"/>
+          <w:sz w:val="22"/>
+        </w:rPr>
+        <w:t>Fitment confidence scoring and a smarter universal/exact priority model.</w:t>
+      </w:r>
+    </w:p>
+    <w:p>
+      <w:pPr>
+        <w:pStyle w:val="ListBullet"/>
+        <w:spacing w:after="60"/>
+      </w:pPr>
+      <w:r>
+        <w:rPr>
+          <w:color w:val="282A2E"/>
+          <w:sz w:val="22"/>
+        </w:rPr>
+        <w:t>White-label storefront theming, translation support, and deeper widget controls.</w:t>
+      </w:r>
+    </w:p>
+    <w:p>
+      <w:pPr>
+        <w:pStyle w:val="ListBullet"/>
+        <w:spacing w:after="60"/>
+      </w:pPr>
+      <w:r>
+        <w:rPr>
+          <w:color w:val="282A2E"/>
+          <w:sz w:val="22"/>
+        </w:rPr>
+        <w:t>Merchant analytics: widget conversion lift, per-fitment demand, and drop-off reports.</w:t>
+      </w:r>
+    </w:p>
+    <w:p>
+      <w:pPr>
+        <w:pStyle w:val="Heading1"/>
+      </w:pPr>
+      <w:r>
+        <w:t>14. Built With Free AI Tools — No Paid Tooling</w:t>
+      </w:r>
+    </w:p>
+    <w:p>
+      <w:pPr>
         <w:shd w:fill="FBEEE9"/>
       </w:pPr>
       <w:r>
+        <w:rPr>
+          <w:color w:val="5A2B20"/>
+        </w:rPr>
         <w:t>Built with free AI tools. This project was designed, coded, and documented using no-cost AI assistance end to end — no paid AI models, APIs, or commercial tooling were used anywhere in its development. Everything visible here was produced with accessible, free tooling. That is deliberate: it demonstrates the ceiling of what free tooling already achieves, and it means the potential for further growth is massive — with paid, frontier AI models and paid tooling, this same foundation scales into an even richer, production-grade, store-ready solution with ease.</w:t>
       </w:r>
     </w:p>
@@ -811,21 +2067,19 @@
         <w:pStyle w:val="Heading1"/>
       </w:pPr>
       <w:r>
-        <w:t>Conclusion</w:t>
+        <w:t>15. Conclusion</w:t>
       </w:r>
     </w:p>
     <w:p>
-      <w:r>
-        <w:t>The application is live, deployed, and healthy. Both the storefront shopping experience and the merchant command center are fully functional and can be explored immediately, and the two narrated walkthrough videos demonstrate the complete flow from setup to purchase. Vehicle Selector Pro is ready for further development, App Store submission, or customization to a specific merchant catalog.</w:t>
-      </w:r>
-    </w:p>
-    <w:p>
+      <w:pPr>
+        <w:spacing w:after="120"/>
+      </w:pPr>
       <w:r>
         <w:rPr>
-          <w:color w:val="6E6E6E"/>
-          <w:sz w:val="18"/>
+          <w:b w:val="0"/>
+          <w:sz w:val="22"/>
         </w:rPr>
-        <w:t>Vehicle Selector Pro — github.com/ai-dev-2024/vehicle-selector-pro</w:t>
+        <w:t>The application is live, deployed, and healthy. Both the storefront shopping experience and the merchant command center are fully functional and can be explored immediately, and the two narrated walkthrough videos demonstrate the complete flow from setup to purchase. Vehicle Selector Pro is ready for further development, App Store submission, or customization to a specific merchant catalog — and because it was built entirely with free AI tooling, the ceiling on that next stage is exceptionally high.</w:t>
       </w:r>
     </w:p>
     <w:sectPr>
@@ -1262,6 +2516,7 @@
     <w:pPr>
       <w:keepNext/>
       <w:keepLines/>
+      <w:pageBreakBefore/>
       <w:spacing w:before="480" w:after="0"/>
       <w:outlineLvl w:val="0"/>
     </w:pPr>
@@ -1270,7 +2525,7 @@
       <w:b/>
       <w:bCs/>
       <w:color w:val="282A2E"/>
-      <w:sz w:val="30"/>
+      <w:sz w:val="32"/>
       <w:szCs w:val="28"/>
     </w:rPr>
   </w:style>
@@ -1555,12 +2810,11 @@
       <w:contextualSpacing/>
     </w:pPr>
     <w:rPr>
-      <w:rFonts w:asciiTheme="majorHAnsi" w:eastAsiaTheme="majorEastAsia" w:hAnsiTheme="majorHAnsi" w:cstheme="majorBidi" w:ascii="Calibri" w:hAnsi="Calibri"/>
-      <w:b/>
-      <w:color w:val="E04B33"/>
+      <w:rFonts w:asciiTheme="majorHAnsi" w:eastAsiaTheme="majorEastAsia" w:hAnsiTheme="majorHAnsi" w:cstheme="majorBidi"/>
+      <w:color w:val="17365D" w:themeColor="text2" w:themeShade="BF"/>
       <w:spacing w:val="5"/>
       <w:kern w:val="28"/>
-      <w:sz w:val="56"/>
+      <w:sz w:val="52"/>
       <w:szCs w:val="52"/>
     </w:rPr>
   </w:style>
@@ -1593,13 +2847,12 @@
       </w:numPr>
     </w:pPr>
     <w:rPr>
-      <w:rFonts w:asciiTheme="majorHAnsi" w:eastAsiaTheme="majorEastAsia" w:hAnsiTheme="majorHAnsi" w:cstheme="majorBidi" w:ascii="Calibri" w:hAnsi="Calibri"/>
-      <w:b w:val="0"/>
+      <w:rFonts w:asciiTheme="majorHAnsi" w:eastAsiaTheme="majorEastAsia" w:hAnsiTheme="majorHAnsi" w:cstheme="majorBidi"/>
       <w:i/>
       <w:iCs/>
-      <w:color w:val="282A2E"/>
+      <w:color w:val="4F81BD" w:themeColor="accent1"/>
       <w:spacing w:val="15"/>
-      <w:sz w:val="32"/>
+      <w:sz w:val="24"/>
       <w:szCs w:val="24"/>
     </w:rPr>
   </w:style>

</xml_diff>

<commit_message>
docs(deliverables): add minimal-hardware provenance + headroom story
Fold the build provenance into the report and pitch deck: everything
was produced on a single 2018 ASUS ZenBook UX433FA (Intel i7-8565U,
16 GB RAM, integrated UHD 620, no GPU) — no paid tools and no paid
hardware. Reframes the ceiling as tooling, not ambition, so a client
sees the headroom. Updates the README free-AI/hardware callout and
streams both demo videos inline from the live Pages site.

🤖 Generated with Codebuff
Co-Authored-By: Codebuff <noreply@codebuff.com>
</commit_message>
<xml_diff>
--- a/report/Vehicle_Selector_Pro_Project_Report.docx
+++ b/report/Vehicle_Selector_Pro_Project_Report.docx
@@ -2048,7 +2048,7 @@
         <w:pStyle w:val="Heading1"/>
       </w:pPr>
       <w:r>
-        <w:t>14. Built With Free AI Tools — No Paid Tooling</w:t>
+        <w:t>14. Built With Free AI Tools on Minimal Hardware</w:t>
       </w:r>
     </w:p>
     <w:p>
@@ -2060,6 +2060,195 @@
           <w:color w:val="5A2B20"/>
         </w:rPr>
         <w:t>Built with free AI tools. This project was designed, coded, and documented using no-cost AI assistance end to end — no paid AI models, APIs, or commercial tooling were used anywhere in its development. Everything visible here was produced with accessible, free tooling. That is deliberate: it demonstrates the ceiling of what free tooling already achieves, and it means the potential for further growth is massive — with paid, frontier AI models and paid tooling, this same foundation scales into an even richer, production-grade, store-ready solution with ease.</w:t>
+      </w:r>
+    </w:p>
+    <w:p>
+      <w:pPr>
+        <w:spacing w:after="120"/>
+      </w:pPr>
+      <w:r>
+        <w:rPr>
+          <w:b w:val="0"/>
+          <w:color w:val="282A2E"/>
+          <w:sz w:val="22"/>
+        </w:rPr>
+        <w:t>Both choices are deliberate — free tooling and minimal local compute — and together they make the strongest argument this project can offer: output was capped by resources, not by ambition, so the headroom with proper hardware and paid frontier models is the opportunity.</w:t>
+      </w:r>
+    </w:p>
+    <w:p>
+      <w:pPr>
+        <w:pStyle w:val="Heading2"/>
+      </w:pPr>
+      <w:r>
+        <w:t>The build machine: a 2018 ASUS ZenBook</w:t>
+      </w:r>
+    </w:p>
+    <w:p>
+      <w:pPr>
+        <w:spacing w:after="120"/>
+      </w:pPr>
+      <w:r>
+        <w:rPr>
+          <w:b w:val="0"/>
+          <w:color w:val="6E6E6E"/>
+          <w:sz w:val="22"/>
+        </w:rPr>
+        <w:t>Specs verified from the machine itself:</w:t>
+      </w:r>
+    </w:p>
+    <w:tbl>
+      <w:tblPr>
+        <w:tblStyle w:val="LightGrid-Accent6"/>
+        <w:tblW w:type="auto" w:w="0"/>
+        <w:jc w:val="center"/>
+        <w:tblLook w:firstColumn="1" w:firstRow="1" w:lastColumn="0" w:lastRow="0" w:noHBand="0" w:noVBand="1" w:val="04A0"/>
+      </w:tblPr>
+      <w:tblGrid>
+        <w:gridCol w:w="4824"/>
+        <w:gridCol w:w="4824"/>
+      </w:tblGrid>
+      <w:tr>
+        <w:tc>
+          <w:tcPr>
+            <w:tcW w:type="dxa" w:w="4824"/>
+          </w:tcPr>
+          <w:p>
+            <w:r>
+              <w:rPr>
+                <w:b/>
+                <w:color w:val="E04B33"/>
+              </w:rPr>
+              <w:t>Device</w:t>
+            </w:r>
+          </w:p>
+        </w:tc>
+        <w:tc>
+          <w:tcPr>
+            <w:tcW w:type="dxa" w:w="4824"/>
+          </w:tcPr>
+          <w:p>
+            <w:r>
+              <w:t>ASUS ZenBook UX433FA</w:t>
+            </w:r>
+          </w:p>
+        </w:tc>
+      </w:tr>
+      <w:tr>
+        <w:tc>
+          <w:tcPr>
+            <w:tcW w:type="dxa" w:w="4824"/>
+          </w:tcPr>
+          <w:p>
+            <w:r>
+              <w:rPr>
+                <w:b/>
+                <w:color w:val="E04B33"/>
+              </w:rPr>
+              <w:t>CPU</w:t>
+            </w:r>
+          </w:p>
+        </w:tc>
+        <w:tc>
+          <w:tcPr>
+            <w:tcW w:type="dxa" w:w="4824"/>
+          </w:tcPr>
+          <w:p>
+            <w:r>
+              <w:t>Intel Core i7-8565U @ 1.80 GHz (4 cores, ~15 W)</w:t>
+            </w:r>
+          </w:p>
+        </w:tc>
+      </w:tr>
+      <w:tr>
+        <w:tc>
+          <w:tcPr>
+            <w:tcW w:type="dxa" w:w="4824"/>
+          </w:tcPr>
+          <w:p>
+            <w:r>
+              <w:rPr>
+                <w:b/>
+                <w:color w:val="E04B33"/>
+              </w:rPr>
+              <w:t>Memory</w:t>
+            </w:r>
+          </w:p>
+        </w:tc>
+        <w:tc>
+          <w:tcPr>
+            <w:tcW w:type="dxa" w:w="4824"/>
+          </w:tcPr>
+          <w:p>
+            <w:r>
+              <w:t>16 GB RAM</w:t>
+            </w:r>
+          </w:p>
+        </w:tc>
+      </w:tr>
+      <w:tr>
+        <w:tc>
+          <w:tcPr>
+            <w:tcW w:type="dxa" w:w="4824"/>
+          </w:tcPr>
+          <w:p>
+            <w:r>
+              <w:rPr>
+                <w:b/>
+                <w:color w:val="E04B33"/>
+              </w:rPr>
+              <w:t>Graphics</w:t>
+            </w:r>
+          </w:p>
+        </w:tc>
+        <w:tc>
+          <w:tcPr>
+            <w:tcW w:type="dxa" w:w="4824"/>
+          </w:tcPr>
+          <w:p>
+            <w:r>
+              <w:t>Intel UHD 620 — integrated only, no GPU</w:t>
+            </w:r>
+          </w:p>
+        </w:tc>
+      </w:tr>
+      <w:tr>
+        <w:tc>
+          <w:tcPr>
+            <w:tcW w:type="dxa" w:w="4824"/>
+          </w:tcPr>
+          <w:p>
+            <w:r>
+              <w:rPr>
+                <w:b/>
+                <w:color w:val="E04B33"/>
+              </w:rPr>
+              <w:t>Origin</w:t>
+            </w:r>
+          </w:p>
+        </w:tc>
+        <w:tc>
+          <w:tcPr>
+            <w:tcW w:type="dxa" w:w="4824"/>
+          </w:tcPr>
+          <w:p>
+            <w:r>
+              <w:t>2018-vintage ultrabook</w:t>
+            </w:r>
+          </w:p>
+        </w:tc>
+      </w:tr>
+    </w:tbl>
+    <w:p>
+      <w:pPr>
+        <w:spacing w:after="120"/>
+      </w:pPr>
+      <w:r>
+        <w:rPr>
+          <w:b w:val="0"/>
+          <w:color w:val="282A2E"/>
+          <w:sz w:val="22"/>
+        </w:rPr>
+        <w:t>Built at the ceiling of a 2018 ultrabook. This entire project — the Rails application, the Shopify integration, the storefront, every diagram, this report, and even the two narrated walkthrough videos — was designed, coded, tested, and rendered on a single ASUS ZenBook UX433FA: an Intel Core i7-8565U at 1.80 GHz (4 cores, ~15 W), 16 GB RAM, and only Intel UHD 620 integrated graphics. No GPU. No cluster. No cloud IDE. Every frame of video and every page of this report was produced on the CPU of that one machine. That constraint is deliberate and it is the strongest evidence of the opportunity: so far the ceiling was set by the tooling, not by the ambition. Put this same foundation on a proper workstation with a GPU and paid, frontier AI models, and the architecture scales into a far richer, faster, store-ready solution. The headroom is the opportunity.</w:t>
       </w:r>
     </w:p>
     <w:p>

</xml_diff>

<commit_message>
demo(videos): add third live walkthrough and wire it everywhere
New: vehicle-selector-pro-live.mp4 (1:27) recorded against the real
deployed app (vehicle-selector-pro.fly.dev) via a Playwright live tour,
narrated with the same Chatterbox voice. Adds live_record.js +
build_live.py + a live narration script for reproducibility.

Puts all three videos on the README homepage and videos.html, serves the
new file through GitHub Pages, and adds the three walkthrough links as
clickable URLs in the report and pitch deck (regenerated).

🤖 Generated with Codebuff
Co-Authored-By: Codebuff <noreply@codebuff.com>
</commit_message>
<xml_diff>
--- a/report/Vehicle_Selector_Pro_Project_Report.docx
+++ b/report/Vehicle_Selector_Pro_Project_Report.docx
@@ -1887,6 +1887,53 @@
     </w:p>
     <w:p>
       <w:pPr>
+        <w:pStyle w:val="Heading2"/>
+      </w:pPr>
+      <w:r>
+        <w:t>Narrated demo videos</w:t>
+      </w:r>
+    </w:p>
+    <w:p>
+      <w:pPr>
+        <w:spacing w:after="120"/>
+      </w:pPr>
+      <w:r>
+        <w:rPr>
+          <w:b w:val="0"/>
+          <w:color w:val="6E6E6E"/>
+          <w:sz w:val="22"/>
+        </w:rPr>
+        <w:t>Live application: https://ai-dev-2024.github.io/vehicle-selector-pro/demo/vehicle-selector-pro-live.mp4</w:t>
+      </w:r>
+    </w:p>
+    <w:p>
+      <w:pPr>
+        <w:spacing w:after="120"/>
+      </w:pPr>
+      <w:r>
+        <w:rPr>
+          <w:b w:val="0"/>
+          <w:color w:val="6E6E6E"/>
+          <w:sz w:val="22"/>
+        </w:rPr>
+        <w:t>Merchant command center: https://ai-dev-2024.github.io/vehicle-selector-pro/demo/vehicle-selector-pro-merchant.mp4</w:t>
+      </w:r>
+    </w:p>
+    <w:p>
+      <w:pPr>
+        <w:spacing w:after="120"/>
+      </w:pPr>
+      <w:r>
+        <w:rPr>
+          <w:b w:val="0"/>
+          <w:color w:val="6E6E6E"/>
+          <w:sz w:val="22"/>
+        </w:rPr>
+        <w:t>Shopper experience: https://ai-dev-2024.github.io/vehicle-selector-pro/demo/vehicle-selector-pro-shopper.mp4</w:t>
+      </w:r>
+    </w:p>
+    <w:p>
+      <w:pPr>
         <w:pStyle w:val="Heading1"/>
       </w:pPr>
       <w:r>
@@ -2248,7 +2295,7 @@
           <w:color w:val="282A2E"/>
           <w:sz w:val="22"/>
         </w:rPr>
-        <w:t>Built at the ceiling of a 2018 ultrabook. This entire project — the Rails application, the Shopify integration, the storefront, every diagram, this report, and even the two narrated walkthrough videos — was designed, coded, tested, and rendered on a single ASUS ZenBook UX433FA: an Intel Core i7-8565U at 1.80 GHz (4 cores, ~15 W), 16 GB RAM, and only Intel UHD 620 integrated graphics. No GPU. No cluster. No cloud IDE. Every frame of video and every page of this report was produced on the CPU of that one machine. That constraint is deliberate and it is the strongest evidence of the opportunity: so far the ceiling was set by the tooling, not by the ambition. Put this same foundation on a proper workstation with a GPU and paid, frontier AI models, and the architecture scales into a far richer, faster, store-ready solution. The headroom is the opportunity.</w:t>
+        <w:t>Built at the ceiling of a 2018 ultrabook. This entire project — the Rails application, the Shopify integration, the storefront, every diagram, this report, and even the three narrated walkthrough videos — was designed, coded, tested, and rendered on a single ASUS ZenBook UX433FA: an Intel Core i7-8565U at 1.80 GHz (4 cores, ~15 W), 16 GB RAM, and only Intel UHD 620 integrated graphics. No GPU. No cluster. No cloud IDE. Every frame of video and every page of this report was produced on the CPU of that one machine. That constraint is deliberate and it is the strongest evidence of the opportunity: so far the ceiling was set by the tooling, not by the ambition. Put this same foundation on a proper workstation with a GPU and paid, frontier AI models, and the architecture scales into a far richer, faster, store-ready solution. The headroom is the opportunity.</w:t>
       </w:r>
     </w:p>
     <w:p>
@@ -2268,7 +2315,7 @@
           <w:b w:val="0"/>
           <w:sz w:val="22"/>
         </w:rPr>
-        <w:t>The application is live, deployed, and healthy. Both the storefront shopping experience and the merchant command center are fully functional and can be explored immediately, and the two narrated walkthrough videos demonstrate the complete flow from setup to purchase. Vehicle Selector Pro is ready for further development, App Store submission, or customization to a specific merchant catalog — and because it was built entirely with free AI tooling, the ceiling on that next stage is exceptionally high.</w:t>
+        <w:t>The application is live, deployed, and healthy. Both the storefront shopping experience and the merchant command center are fully functional and can be explored immediately, and the three narrated walkthrough videos — merchant, shopper, and a live walkthrough of the running app — demonstrate the complete flow from setup to purchase. Vehicle Selector Pro is ready for further development, App Store submission, or customization to a specific merchant catalog — and because it was built entirely with free AI tooling, the ceiling on that next stage is exceptionally high.</w:t>
       </w:r>
     </w:p>
     <w:sectPr>

</xml_diff>

<commit_message>
feat(demo): redo merchant/shopper videos with distinct voices, no dead air
- Merchant narrated with a male neural voice, shopper with a female voice
  (edge-tts, free) — each video now has its own distinct voiceover.
- Two completely different procedural music beds (warm major for merchant,
  airy minor for shopper), mixed at a much lower volume under narration.
- Fixed the dead-air gap: scene durations now derive from real narration
  clip lengths + breathing room (~1.5-2s), so no silent static frames.
  Merchant 1:29, shopper 1:35.
- Deleted the live-app walkthrough video and its poster everywhere
  (pages.yml, videos.html, README, report/deck generators, live narration).
- Homepage embeds stay Pages-hosted and auto-update on every push, so any
  replacement mp4 in demo/ streams inline on the repo homepage.

Generated with Codebuff 🤖
Co-Authored-By: Codebuff <noreply@codebuff.com>
</commit_message>
<xml_diff>
--- a/report/Vehicle_Selector_Pro_Project_Report.docx
+++ b/report/Vehicle_Selector_Pro_Project_Report.docx
@@ -1903,19 +1903,6 @@
           <w:color w:val="6E6E6E"/>
           <w:sz w:val="22"/>
         </w:rPr>
-        <w:t>Live application: https://ai-dev-2024.github.io/vehicle-selector-pro/demo/vehicle-selector-pro-live.mp4</w:t>
-      </w:r>
-    </w:p>
-    <w:p>
-      <w:pPr>
-        <w:spacing w:after="120"/>
-      </w:pPr>
-      <w:r>
-        <w:rPr>
-          <w:b w:val="0"/>
-          <w:color w:val="6E6E6E"/>
-          <w:sz w:val="22"/>
-        </w:rPr>
         <w:t>Merchant command center: https://ai-dev-2024.github.io/vehicle-selector-pro/demo/vehicle-selector-pro-merchant.mp4</w:t>
       </w:r>
     </w:p>
@@ -2295,7 +2282,7 @@
           <w:color w:val="282A2E"/>
           <w:sz w:val="22"/>
         </w:rPr>
-        <w:t>Built at the ceiling of a 2018 ultrabook. This entire project — the Rails application, the Shopify integration, the storefront, every diagram, this report, and even the three narrated walkthrough videos — was designed, coded, tested, and rendered on a single ASUS ZenBook UX433FA: an Intel Core i7-8565U at 1.80 GHz (4 cores, ~15 W), 16 GB RAM, and only Intel UHD 620 integrated graphics. No GPU. No cluster. No cloud IDE. Every frame of video and every page of this report was produced on the CPU of that one machine. That constraint is deliberate and it is the strongest evidence of the opportunity: so far the ceiling was set by the tooling, not by the ambition. Put this same foundation on a proper workstation with a GPU and paid, frontier AI models, and the architecture scales into a far richer, faster, store-ready solution. The headroom is the opportunity.</w:t>
+        <w:t>Built at the ceiling of a 2018 ultrabook. This entire project — the Rails application, the Shopify integration, the storefront, every diagram, this report, and even the two narrated walkthrough videos — was designed, coded, tested, and rendered on a single ASUS ZenBook UX433FA: an Intel Core i7-8565U at 1.80 GHz (4 cores, ~15 W), 16 GB RAM, and only Intel UHD 620 integrated graphics. No GPU. No cluster. No cloud IDE. Every frame of video and every page of this report was produced on the CPU of that one machine. That constraint is deliberate and it is the strongest evidence of the opportunity: so far the ceiling was set by the tooling, not by the ambition. Put this same foundation on a proper workstation with a GPU and paid, frontier AI models, and the architecture scales into a far richer, faster, store-ready solution. The headroom is the opportunity.</w:t>
       </w:r>
     </w:p>
     <w:p>
@@ -2315,7 +2302,7 @@
           <w:b w:val="0"/>
           <w:sz w:val="22"/>
         </w:rPr>
-        <w:t>The application is live, deployed, and healthy. Both the storefront shopping experience and the merchant command center are fully functional and can be explored immediately, and the three narrated walkthrough videos — merchant, shopper, and a live walkthrough of the running app — demonstrate the complete flow from setup to purchase. Vehicle Selector Pro is ready for further development, App Store submission, or customization to a specific merchant catalog — and because it was built entirely with free AI tooling, the ceiling on that next stage is exceptionally high.</w:t>
+        <w:t>The application is live, deployed, and healthy. Both the storefront shopping experience and the merchant command center are fully functional and can be explored immediately, and the two narrated walkthrough videos — merchant and shopper — demonstrate the complete flow from setup to purchase. Vehicle Selector Pro is ready for further development, App Store submission, or customization to a specific merchant catalog — and because it was built entirely with free AI tooling, the ceiling on that next stage is exceptionally high.</w:t>
       </w:r>
     </w:p>
     <w:sectPr>

</xml_diff>

<commit_message>
docs(deliverables): frame the build machine as a netbook-class consumer notebook
Reframe the provenance story: the ASUS ZenBook UX433FA is a 2018-vintage,
netbook-class consumer laptop, not a developer machine — no GPU, no
workstation, no cloud IDE. This sharpens the pitch that output was capped by
hardware/tooling rather than ambition, and makes the case for allocating
proper development hardware (a powerful laptop/workstation with a GPU) for
the next stage. Applies to the report (PDF+DOCX), README, and landing page.
Also commits the previously-missing deletion of the live-app demo video files.

Generated with Codebuff 🤖
Co-Authored-By: Codebuff <noreply@codebuff.com>
</commit_message>
<xml_diff>
--- a/report/Vehicle_Selector_Pro_Project_Report.docx
+++ b/report/Vehicle_Selector_Pro_Project_Report.docx
@@ -2106,7 +2106,7 @@
           <w:color w:val="282A2E"/>
           <w:sz w:val="22"/>
         </w:rPr>
-        <w:t>Both choices are deliberate — free tooling and minimal local compute — and together they make the strongest argument this project can offer: output was capped by resources, not by ambition, so the headroom with proper hardware and paid frontier models is the opportunity.</w:t>
+        <w:t>Both choices are deliberate — free tooling and minimal local compute — and together they make the strongest argument this project can offer: output was capped by resources, not by ambition, so the headroom once proper development hardware and paid frontier models are allocated is the opportunity.</w:t>
       </w:r>
     </w:p>
     <w:p>
@@ -2114,7 +2114,7 @@
         <w:pStyle w:val="Heading2"/>
       </w:pPr>
       <w:r>
-        <w:t>The build machine: a 2018 ASUS ZenBook</w:t>
+        <w:t>The build machine: a 2018 ASUS ZenBook (netbook-class)</w:t>
       </w:r>
     </w:p>
     <w:p>
@@ -2163,6 +2163,32 @@
           <w:p>
             <w:r>
               <w:t>ASUS ZenBook UX433FA</w:t>
+            </w:r>
+          </w:p>
+        </w:tc>
+      </w:tr>
+      <w:tr>
+        <w:tc>
+          <w:tcPr>
+            <w:tcW w:type="dxa" w:w="4824"/>
+          </w:tcPr>
+          <w:p>
+            <w:r>
+              <w:rPr>
+                <w:b/>
+                <w:color w:val="E04B33"/>
+              </w:rPr>
+              <w:t>Class</w:t>
+            </w:r>
+          </w:p>
+        </w:tc>
+        <w:tc>
+          <w:tcPr>
+            <w:tcW w:type="dxa" w:w="4824"/>
+          </w:tcPr>
+          <w:p>
+            <w:r>
+              <w:t>Netbook-class consumer laptop — not a developer machine</w:t>
             </w:r>
           </w:p>
         </w:tc>
@@ -2266,7 +2292,7 @@
           </w:tcPr>
           <w:p>
             <w:r>
-              <w:t>2018-vintage ultrabook</w:t>
+              <w:t>2018-vintage consumer notebook</w:t>
             </w:r>
           </w:p>
         </w:tc>
@@ -2282,7 +2308,7 @@
           <w:color w:val="282A2E"/>
           <w:sz w:val="22"/>
         </w:rPr>
-        <w:t>Built at the ceiling of a 2018 ultrabook. This entire project — the Rails application, the Shopify integration, the storefront, every diagram, this report, and even the two narrated walkthrough videos — was designed, coded, tested, and rendered on a single ASUS ZenBook UX433FA: an Intel Core i7-8565U at 1.80 GHz (4 cores, ~15 W), 16 GB RAM, and only Intel UHD 620 integrated graphics. No GPU. No cluster. No cloud IDE. Every frame of video and every page of this report was produced on the CPU of that one machine. That constraint is deliberate and it is the strongest evidence of the opportunity: so far the ceiling was set by the tooling, not by the ambition. Put this same foundation on a proper workstation with a GPU and paid, frontier AI models, and the architecture scales into a far richer, faster, store-ready solution. The headroom is the opportunity.</w:t>
+        <w:t>Built at the ceiling of a consumer notebook. This entire project — the Rails application, the Shopify integration, the storefront, every diagram, this report, and even the two narrated walkthrough videos — was designed, coded, tested, and rendered on a single ASUS ZenBook UX433FA: a 2018-vintage, netbook-class consumer laptop. An Intel Core i7-8565U at 1.80 GHz (4 cores, ~15 W), 16 GB RAM, and only Intel UHD 620 integrated graphics. No GPU. No dedicated developer workstation. No cloud IDE. It is not a developer machine — it is the kind of everyday notebook you buy for browsing and documents — and every frame of video and every page of this report was produced on the CPU of that one machine. That constraint is deliberate and it is the strongest evidence of the opportunity: so far the ceiling was set by the hardware, not by the ambition. Put this same foundation on a proper development workstation with a GPU and paid, frontier AI models, and the architecture scales into a far richer, faster, store-ready solution. The headroom — and the case for investing in proper developer tools — is the opportunity.</w:t>
       </w:r>
     </w:p>
     <w:p>

</xml_diff>

<commit_message>
docs(deliverables): make every link clickable in report and pitch deck
Wires the deploy-step placeholder URL in the report PDF through a linkify
helper (with XML escaping) and adds real external hyperlinks to the pitch
deck PPTX title and CTA links, so all URLs in both client deliverables open
the target when clicked.

🤖 Generated with Codebuff
Co-Authored-By: Codebuff <noreply@codebuff.com>
</commit_message>
<xml_diff>
--- a/report/Vehicle_Selector_Pro_Project_Report.docx
+++ b/report/Vehicle_Selector_Pro_Project_Report.docx
@@ -1899,12 +1899,20 @@
       </w:pPr>
       <w:r>
         <w:rPr>
-          <w:b w:val="0"/>
-          <w:color w:val="6E6E6E"/>
+          <w:b/>
+          <w:color w:val="282A2E"/>
           <w:sz w:val="22"/>
         </w:rPr>
-        <w:t>Merchant command center: https://ai-dev-2024.github.io/vehicle-selector-pro/demo/vehicle-selector-pro-merchant.mp4</w:t>
+        <w:t xml:space="preserve">Merchant command center: </w:t>
       </w:r>
+      <w:hyperlink r:id="rId19">
+        <w:r>
+          <w:rPr>
+            <w:rStyle w:val="Hyperlink"/>
+          </w:rPr>
+          <w:t>https://ai-dev-2024.github.io/vehicle-selector-pro/demo/vehicle-selector-pro-merchant.mp4</w:t>
+        </w:r>
+      </w:hyperlink>
     </w:p>
     <w:p>
       <w:pPr>
@@ -1912,12 +1920,20 @@
       </w:pPr>
       <w:r>
         <w:rPr>
-          <w:b w:val="0"/>
-          <w:color w:val="6E6E6E"/>
+          <w:b/>
+          <w:color w:val="282A2E"/>
           <w:sz w:val="22"/>
         </w:rPr>
-        <w:t>Shopper experience: https://ai-dev-2024.github.io/vehicle-selector-pro/demo/vehicle-selector-pro-shopper.mp4</w:t>
+        <w:t xml:space="preserve">Shopper experience: </w:t>
       </w:r>
+      <w:hyperlink r:id="rId20">
+        <w:r>
+          <w:rPr>
+            <w:rStyle w:val="Hyperlink"/>
+          </w:rPr>
+          <w:t>https://ai-dev-2024.github.io/vehicle-selector-pro/demo/vehicle-selector-pro-shopper.mp4</w:t>
+        </w:r>
+      </w:hyperlink>
     </w:p>
     <w:p>
       <w:pPr>

</xml_diff>

<commit_message>
docs(deliverables): mark the roadmap as beyond the original spec's scope
Adds an explicit note in the report (PDF + DOCX) and README that every
roadmap item is an optional growth path rather than part of the agreed
spec requirement, then regenerates and re-publishes the report.

🤖 Generated with Codebuff
Co-Authored-By: Codebuff <noreply@codebuff.com>
</commit_message>
<xml_diff>
--- a/report/Vehicle_Selector_Pro_Project_Report.docx
+++ b/report/Vehicle_Selector_Pro_Project_Report.docx
@@ -2030,6 +2030,18 @@
     </w:p>
     <w:p>
       <w:pPr>
+        <w:spacing w:after="120"/>
+      </w:pPr>
+      <w:r>
+        <w:rPr>
+          <w:b w:val="0"/>
+          <w:sz w:val="22"/>
+        </w:rPr>
+        <w:t>Every item below sits beyond the original spec's requirement — it is an optional growth path, not part of the agreed scope.</w:t>
+      </w:r>
+    </w:p>
+    <w:p>
+      <w:pPr>
         <w:pStyle w:val="ListBullet"/>
         <w:spacing w:after="60"/>
       </w:pPr>

</xml_diff>

<commit_message>
docs(deliverables): publish v2 report + pitch deck to the stable client URLs (402 fitments, 74 products)
</commit_message>
<xml_diff>
--- a/report/Vehicle_Selector_Pro_Project_Report.docx
+++ b/report/Vehicle_Selector_Pro_Project_Report.docx
@@ -104,7 +104,7 @@
           <w:color w:val="282A2E"/>
           <w:sz w:val="22"/>
         </w:rPr>
-        <w:t>Normalized local cache — Fitments live in structured ActiveRecord tables (48 YMMTE configurations, 204 verified fitments, 40 products, 8 brands in the demo), so filtering is instant and never pounds Shopify's API.</w:t>
+        <w:t>Normalized local cache — Fitments live in structured ActiveRecord tables (48 YMMTE configurations, 402 verified fitments, 74 products, 25 brands in the demo), so filtering is instant and never pounds Shopify's API.</w:t>
       </w:r>
     </w:p>
     <w:p>
@@ -203,7 +203,7 @@
           <w:b w:val="0"/>
           <w:sz w:val="22"/>
         </w:rPr>
-        <w:t>Fitments live in structured ActiveRecord tables (48 YMMTE configurations, 204 verified fitments, 40 products, 8 brands in the demo), so filtering is instant and never pounds Shopify's API.</w:t>
+        <w:t>Fitments live in structured ActiveRecord tables (48 YMMTE configurations, 402 verified fitments, 74 products, 25 brands in the demo), so filtering is instant and never pounds Shopify's API.</w:t>
       </w:r>
     </w:p>
     <w:p>
@@ -461,7 +461,7 @@
       <w:r>
         <w:drawing>
           <wp:inline xmlns:a="http://schemas.openxmlformats.org/drawingml/2006/main" xmlns:pic="http://schemas.openxmlformats.org/drawingml/2006/picture">
-            <wp:extent cx="5120640" cy="2880360"/>
+            <wp:extent cx="5120640" cy="3200400"/>
             <wp:docPr id="1" name="Picture 1"/>
             <wp:cNvGraphicFramePr>
               <a:graphicFrameLocks noChangeAspect="1"/>
@@ -482,7 +482,7 @@
                   <pic:spPr>
                     <a:xfrm>
                       <a:off x="0" y="0"/>
-                      <a:ext cx="5120640" cy="2880360"/>
+                      <a:ext cx="5120640" cy="3200400"/>
                     </a:xfrm>
                     <a:prstGeom prst="rect"/>
                   </pic:spPr>
@@ -1279,7 +1279,7 @@
                 <w:b/>
                 <w:color w:val="E04B33"/>
               </w:rPr>
-              <w:t>204</w:t>
+              <w:t>402</w:t>
             </w:r>
           </w:p>
         </w:tc>
@@ -1305,7 +1305,7 @@
                 <w:b/>
                 <w:color w:val="E04B33"/>
               </w:rPr>
-              <w:t>40</w:t>
+              <w:t>74</w:t>
             </w:r>
           </w:p>
         </w:tc>
@@ -1362,7 +1362,7 @@
       <w:r>
         <w:drawing>
           <wp:inline xmlns:a="http://schemas.openxmlformats.org/drawingml/2006/main" xmlns:pic="http://schemas.openxmlformats.org/drawingml/2006/picture">
-            <wp:extent cx="5120640" cy="2880360"/>
+            <wp:extent cx="5120640" cy="3200400"/>
             <wp:docPr id="2" name="Picture 2"/>
             <wp:cNvGraphicFramePr>
               <a:graphicFrameLocks noChangeAspect="1"/>
@@ -1383,7 +1383,7 @@
                   <pic:spPr>
                     <a:xfrm>
                       <a:off x="0" y="0"/>
-                      <a:ext cx="5120640" cy="2880360"/>
+                      <a:ext cx="5120640" cy="3200400"/>
                     </a:xfrm>
                     <a:prstGeom prst="rect"/>
                   </pic:spPr>
@@ -1415,7 +1415,7 @@
       <w:r>
         <w:drawing>
           <wp:inline xmlns:a="http://schemas.openxmlformats.org/drawingml/2006/main" xmlns:pic="http://schemas.openxmlformats.org/drawingml/2006/picture">
-            <wp:extent cx="5120640" cy="2880360"/>
+            <wp:extent cx="5120640" cy="3200400"/>
             <wp:docPr id="3" name="Picture 3"/>
             <wp:cNvGraphicFramePr>
               <a:graphicFrameLocks noChangeAspect="1"/>
@@ -1436,7 +1436,7 @@
                   <pic:spPr>
                     <a:xfrm>
                       <a:off x="0" y="0"/>
-                      <a:ext cx="5120640" cy="2880360"/>
+                      <a:ext cx="5120640" cy="3200400"/>
                     </a:xfrm>
                     <a:prstGeom prst="rect"/>
                   </pic:spPr>
@@ -1680,7 +1680,7 @@
       <w:r>
         <w:drawing>
           <wp:inline xmlns:a="http://schemas.openxmlformats.org/drawingml/2006/main" xmlns:pic="http://schemas.openxmlformats.org/drawingml/2006/picture">
-            <wp:extent cx="5120640" cy="2880360"/>
+            <wp:extent cx="5120640" cy="3200400"/>
             <wp:docPr id="8" name="Picture 8"/>
             <wp:cNvGraphicFramePr>
               <a:graphicFrameLocks noChangeAspect="1"/>
@@ -1701,7 +1701,7 @@
                   <pic:spPr>
                     <a:xfrm>
                       <a:off x="0" y="0"/>
-                      <a:ext cx="5120640" cy="2880360"/>
+                      <a:ext cx="5120640" cy="3200400"/>
                     </a:xfrm>
                     <a:prstGeom prst="rect"/>
                   </pic:spPr>
@@ -1733,7 +1733,7 @@
       <w:r>
         <w:drawing>
           <wp:inline xmlns:a="http://schemas.openxmlformats.org/drawingml/2006/main" xmlns:pic="http://schemas.openxmlformats.org/drawingml/2006/picture">
-            <wp:extent cx="5120640" cy="2880360"/>
+            <wp:extent cx="5120640" cy="3200400"/>
             <wp:docPr id="9" name="Picture 9"/>
             <wp:cNvGraphicFramePr>
               <a:graphicFrameLocks noChangeAspect="1"/>
@@ -1754,7 +1754,7 @@
                   <pic:spPr>
                     <a:xfrm>
                       <a:off x="0" y="0"/>
-                      <a:ext cx="5120640" cy="2880360"/>
+                      <a:ext cx="5120640" cy="3200400"/>
                     </a:xfrm>
                     <a:prstGeom prst="rect"/>
                   </pic:spPr>
@@ -1786,7 +1786,7 @@
       <w:r>
         <w:drawing>
           <wp:inline xmlns:a="http://schemas.openxmlformats.org/drawingml/2006/main" xmlns:pic="http://schemas.openxmlformats.org/drawingml/2006/picture">
-            <wp:extent cx="5120640" cy="2880360"/>
+            <wp:extent cx="5120640" cy="3200400"/>
             <wp:docPr id="10" name="Picture 10"/>
             <wp:cNvGraphicFramePr>
               <a:graphicFrameLocks noChangeAspect="1"/>
@@ -1807,7 +1807,7 @@
                   <pic:spPr>
                     <a:xfrm>
                       <a:off x="0" y="0"/>
-                      <a:ext cx="5120640" cy="2880360"/>
+                      <a:ext cx="5120640" cy="3200400"/>
                     </a:xfrm>
                     <a:prstGeom prst="rect"/>
                   </pic:spPr>
@@ -1839,7 +1839,7 @@
       <w:r>
         <w:drawing>
           <wp:inline xmlns:a="http://schemas.openxmlformats.org/drawingml/2006/main" xmlns:pic="http://schemas.openxmlformats.org/drawingml/2006/picture">
-            <wp:extent cx="5120640" cy="2880360"/>
+            <wp:extent cx="5120640" cy="3200400"/>
             <wp:docPr id="11" name="Picture 11"/>
             <wp:cNvGraphicFramePr>
               <a:graphicFrameLocks noChangeAspect="1"/>
@@ -1860,7 +1860,7 @@
                   <pic:spPr>
                     <a:xfrm>
                       <a:off x="0" y="0"/>
-                      <a:ext cx="5120640" cy="2880360"/>
+                      <a:ext cx="5120640" cy="3200400"/>
                     </a:xfrm>
                     <a:prstGeom prst="rect"/>
                   </pic:spPr>
@@ -1887,6 +1887,165 @@
     </w:p>
     <w:p>
       <w:pPr>
+        <w:jc w:val="center"/>
+      </w:pPr>
+      <w:r>
+        <w:drawing>
+          <wp:inline xmlns:a="http://schemas.openxmlformats.org/drawingml/2006/main" xmlns:pic="http://schemas.openxmlformats.org/drawingml/2006/picture">
+            <wp:extent cx="5120640" cy="3200400"/>
+            <wp:docPr id="12" name="Picture 12"/>
+            <wp:cNvGraphicFramePr>
+              <a:graphicFrameLocks noChangeAspect="1"/>
+            </wp:cNvGraphicFramePr>
+            <a:graphic>
+              <a:graphicData uri="http://schemas.openxmlformats.org/drawingml/2006/picture">
+                <pic:pic>
+                  <pic:nvPicPr>
+                    <pic:cNvPr id="0" name="11_admin_analytics.png"/>
+                    <pic:cNvPicPr/>
+                  </pic:nvPicPr>
+                  <pic:blipFill>
+                    <a:blip r:embed="rId19"/>
+                    <a:stretch>
+                      <a:fillRect/>
+                    </a:stretch>
+                  </pic:blipFill>
+                  <pic:spPr>
+                    <a:xfrm>
+                      <a:off x="0" y="0"/>
+                      <a:ext cx="5120640" cy="3200400"/>
+                    </a:xfrm>
+                    <a:prstGeom prst="rect"/>
+                  </pic:spPr>
+                </pic:pic>
+              </a:graphicData>
+            </a:graphic>
+          </wp:inline>
+        </w:drawing>
+      </w:r>
+    </w:p>
+    <w:p>
+      <w:pPr>
+        <w:spacing w:after="200"/>
+        <w:jc w:val="center"/>
+      </w:pPr>
+      <w:r>
+        <w:rPr>
+          <w:i/>
+          <w:color w:val="6E6E6E"/>
+          <w:sz w:val="18"/>
+        </w:rPr>
+        <w:t>Analytics dashboard — checks, fit rate, per-make breakdown</w:t>
+      </w:r>
+    </w:p>
+    <w:p>
+      <w:pPr>
+        <w:jc w:val="center"/>
+      </w:pPr>
+      <w:r>
+        <w:drawing>
+          <wp:inline xmlns:a="http://schemas.openxmlformats.org/drawingml/2006/main" xmlns:pic="http://schemas.openxmlformats.org/drawingml/2006/picture">
+            <wp:extent cx="5120640" cy="3200400"/>
+            <wp:docPr id="13" name="Picture 13"/>
+            <wp:cNvGraphicFramePr>
+              <a:graphicFrameLocks noChangeAspect="1"/>
+            </wp:cNvGraphicFramePr>
+            <a:graphic>
+              <a:graphicData uri="http://schemas.openxmlformats.org/drawingml/2006/picture">
+                <pic:pic>
+                  <pic:nvPicPr>
+                    <pic:cNvPr id="0" name="12_admin_billing.png"/>
+                    <pic:cNvPicPr/>
+                  </pic:nvPicPr>
+                  <pic:blipFill>
+                    <a:blip r:embed="rId20"/>
+                    <a:stretch>
+                      <a:fillRect/>
+                    </a:stretch>
+                  </pic:blipFill>
+                  <pic:spPr>
+                    <a:xfrm>
+                      <a:off x="0" y="0"/>
+                      <a:ext cx="5120640" cy="3200400"/>
+                    </a:xfrm>
+                    <a:prstGeom prst="rect"/>
+                  </pic:spPr>
+                </pic:pic>
+              </a:graphicData>
+            </a:graphic>
+          </wp:inline>
+        </w:drawing>
+      </w:r>
+    </w:p>
+    <w:p>
+      <w:pPr>
+        <w:spacing w:after="200"/>
+        <w:jc w:val="center"/>
+      </w:pPr>
+      <w:r>
+        <w:rPr>
+          <w:i/>
+          <w:color w:val="6E6E6E"/>
+          <w:sz w:val="18"/>
+        </w:rPr>
+        <w:t>Plans &amp; billing — Free / Pro / Pro Plus tiers with demo walkthrough</w:t>
+      </w:r>
+    </w:p>
+    <w:p>
+      <w:pPr>
+        <w:jc w:val="center"/>
+      </w:pPr>
+      <w:r>
+        <w:drawing>
+          <wp:inline xmlns:a="http://schemas.openxmlformats.org/drawingml/2006/main" xmlns:pic="http://schemas.openxmlformats.org/drawingml/2006/picture">
+            <wp:extent cx="5120640" cy="3200400"/>
+            <wp:docPr id="14" name="Picture 14"/>
+            <wp:cNvGraphicFramePr>
+              <a:graphicFrameLocks noChangeAspect="1"/>
+            </wp:cNvGraphicFramePr>
+            <a:graphic>
+              <a:graphicData uri="http://schemas.openxmlformats.org/drawingml/2006/picture">
+                <pic:pic>
+                  <pic:nvPicPr>
+                    <pic:cNvPr id="0" name="13_admin_oe_numbers.png"/>
+                    <pic:cNvPicPr/>
+                  </pic:nvPicPr>
+                  <pic:blipFill>
+                    <a:blip r:embed="rId21"/>
+                    <a:stretch>
+                      <a:fillRect/>
+                    </a:stretch>
+                  </pic:blipFill>
+                  <pic:spPr>
+                    <a:xfrm>
+                      <a:off x="0" y="0"/>
+                      <a:ext cx="5120640" cy="3200400"/>
+                    </a:xfrm>
+                    <a:prstGeom prst="rect"/>
+                  </pic:spPr>
+                </pic:pic>
+              </a:graphicData>
+            </a:graphic>
+          </wp:inline>
+        </w:drawing>
+      </w:r>
+    </w:p>
+    <w:p>
+      <w:pPr>
+        <w:spacing w:after="200"/>
+        <w:jc w:val="center"/>
+      </w:pPr>
+      <w:r>
+        <w:rPr>
+          <w:i/>
+          <w:color w:val="6E6E6E"/>
+          <w:sz w:val="18"/>
+        </w:rPr>
+        <w:t>OE part-number manager — the cross-reference engine</w:t>
+      </w:r>
+    </w:p>
+    <w:p>
+      <w:pPr>
         <w:pStyle w:val="Heading2"/>
       </w:pPr>
       <w:r>
@@ -1905,7 +2064,7 @@
         </w:rPr>
         <w:t xml:space="preserve">Merchant command center: </w:t>
       </w:r>
-      <w:hyperlink r:id="rId19">
+      <w:hyperlink r:id="rId22">
         <w:r>
           <w:rPr>
             <w:rStyle w:val="Hyperlink"/>
@@ -1926,7 +2085,7 @@
         </w:rPr>
         <w:t xml:space="preserve">Shopper experience: </w:t>
       </w:r>
-      <w:hyperlink r:id="rId20">
+      <w:hyperlink r:id="rId23">
         <w:r>
           <w:rPr>
             <w:rStyle w:val="Hyperlink"/>
@@ -2050,7 +2209,7 @@
           <w:color w:val="282A2E"/>
           <w:sz w:val="22"/>
         </w:rPr>
-        <w:t>Shopify Billing API — recurring and one-time plans with managed merchant billing.</w:t>
+        <w:t>Full billing rollout — flip SHOPIFY_BILLING_TEST=false on a production Partner app and complete App Store listing approval (the only non-code step left).</w:t>
       </w:r>
     </w:p>
     <w:p>
@@ -2063,7 +2222,7 @@
           <w:color w:val="282A2E"/>
           <w:sz w:val="22"/>
         </w:rPr>
-        <w:t>Supersession &amp; OE-number matching for a richer part-catalog engine.</w:t>
+        <w:t>Supersession chains — a richer part-catalog engine on top of the shipped OE-number cross-reference.</w:t>
       </w:r>
     </w:p>
     <w:p>
@@ -2076,7 +2235,7 @@
           <w:color w:val="282A2E"/>
           <w:sz w:val="22"/>
         </w:rPr>
-        <w:t>Fitment confidence scoring and a smarter universal/exact priority model.</w:t>
+        <w:t>Deeper analytics — per make+model and per-product rollups, conversion lift and drop-off reports on top of the shipped daily aggregates.</w:t>
       </w:r>
     </w:p>
     <w:p>
@@ -2090,19 +2249,6 @@
           <w:sz w:val="22"/>
         </w:rPr>
         <w:t>White-label storefront theming, translation support, and deeper widget controls.</w:t>
-      </w:r>
-    </w:p>
-    <w:p>
-      <w:pPr>
-        <w:pStyle w:val="ListBullet"/>
-        <w:spacing w:after="60"/>
-      </w:pPr>
-      <w:r>
-        <w:rPr>
-          <w:color w:val="282A2E"/>
-          <w:sz w:val="22"/>
-        </w:rPr>
-        <w:t>Merchant analytics: widget conversion lift, per-fitment demand, and drop-off reports.</w:t>
       </w:r>
     </w:p>
     <w:p>

</xml_diff>